<commit_message>
feat(leads): orden y estilos en Contactado y Cierres
Prioriza post-entrevista sin compra en Contactado con color naranja, ordena Cierres por fecha de venta y adapta el banner informativo para promotores.

Co-authored-by: Cursor <cursoragent@cursor.com>
</commit_message>
<xml_diff>
--- a/docs/DOCUMENTACION_SISTEMA.docx
+++ b/docs/DOCUMENTACION_SISTEMA.docx
@@ -10352,7 +10352,7 @@
       <w:pPr>
         <w:shd w:val="clear" w:color="auto" w:fill="F2F5FA"/>
         <w:spacing w:before="150" w:after="150"/>
-        <w:divId w:val="1484277661"/>
+        <w:divId w:val="1990673343"/>
         <w:rPr>
           <w:rFonts w:ascii="Calibri" w:eastAsia="Times New Roman" w:hAnsi="Calibri" w:cs="Calibri"/>
           <w:color w:val="333333"/>
@@ -12823,7 +12823,7 @@
       <w:pPr>
         <w:shd w:val="clear" w:color="auto" w:fill="F2F5FA"/>
         <w:spacing w:before="150" w:after="150"/>
-        <w:divId w:val="572130869"/>
+        <w:divId w:val="191848933"/>
         <w:rPr>
           <w:rFonts w:ascii="Calibri" w:eastAsia="Times New Roman" w:hAnsi="Calibri" w:cs="Calibri"/>
           <w:color w:val="333333"/>
@@ -15106,7 +15106,7 @@
       <w:pPr>
         <w:shd w:val="clear" w:color="auto" w:fill="F2F5FA"/>
         <w:spacing w:before="150" w:after="150"/>
-        <w:divId w:val="386758729"/>
+        <w:divId w:val="613556640"/>
         <w:rPr>
           <w:rFonts w:ascii="Calibri" w:eastAsia="Times New Roman" w:hAnsi="Calibri" w:cs="Calibri"/>
           <w:color w:val="333333"/>
@@ -16355,7 +16355,7 @@
       <w:pPr>
         <w:shd w:val="clear" w:color="auto" w:fill="F2F5FA"/>
         <w:spacing w:before="150" w:after="150"/>
-        <w:divId w:val="1110314503"/>
+        <w:divId w:val="575869634"/>
         <w:rPr>
           <w:rFonts w:ascii="Calibri" w:eastAsia="Times New Roman" w:hAnsi="Calibri" w:cs="Calibri"/>
           <w:color w:val="333333"/>
@@ -30776,7 +30776,7 @@
       <w:pPr>
         <w:shd w:val="clear" w:color="auto" w:fill="F2F5FA"/>
         <w:spacing w:before="150" w:after="150"/>
-        <w:divId w:val="267473383"/>
+        <w:divId w:val="239828737"/>
         <w:rPr>
           <w:rFonts w:ascii="Calibri" w:eastAsia="Times New Roman" w:hAnsi="Calibri" w:cs="Calibri"/>
           <w:color w:val="333333"/>
@@ -35960,6 +35960,22 @@
     </w:p>
     <w:p>
       <w:pPr>
+        <w:pStyle w:val="Ttulo2"/>
+        <w:rPr>
+          <w:rFonts w:ascii="Calibri" w:eastAsia="Times New Roman" w:hAnsi="Calibri" w:cs="Calibri"/>
+          <w:lang w:val="es-ES"/>
+        </w:rPr>
+      </w:pPr>
+      <w:r>
+        <w:rPr>
+          <w:rFonts w:ascii="Calibri" w:eastAsia="Times New Roman" w:hAnsi="Calibri" w:cs="Calibri"/>
+          <w:lang w:val="es-ES"/>
+        </w:rPr>
+        <w:t>15. Actualización — nuevas funcionalidades (junio 2026, segunda entrega)</w:t>
+      </w:r>
+    </w:p>
+    <w:p>
+      <w:pPr>
         <w:pStyle w:val="subtitle"/>
         <w:rPr>
           <w:rFonts w:ascii="Calibri" w:hAnsi="Calibri" w:cs="Calibri"/>
@@ -35968,15 +35984,6 @@
           <w:lang w:val="es-ES"/>
         </w:rPr>
       </w:pPr>
-      <w:r>
-        <w:rPr>
-          <w:rFonts w:ascii="Calibri" w:hAnsi="Calibri" w:cs="Calibri"/>
-          <w:sz w:val="22"/>
-          <w:szCs w:val="22"/>
-          <w:lang w:val="es-ES"/>
-        </w:rPr>
-        <w:t xml:space="preserve">Las novedades se agregan en </w:t>
-      </w:r>
       <w:r>
         <w:rPr>
           <w:rStyle w:val="Fuerte"/>
@@ -35985,7 +35992,2351 @@
           <w:szCs w:val="22"/>
           <w:lang w:val="es-ES"/>
         </w:rPr>
+        <w:t>Añadido:</w:t>
+      </w:r>
+      <w:r>
+        <w:rPr>
+          <w:rFonts w:ascii="Calibri" w:hAnsi="Calibri" w:cs="Calibri"/>
+          <w:sz w:val="22"/>
+          <w:szCs w:val="22"/>
+          <w:lang w:val="es-ES"/>
+        </w:rPr>
+        <w:t xml:space="preserve"> 5 jun 2026. Complementa §14 sin modificar secciones 1–13.</w:t>
+      </w:r>
+    </w:p>
+    <w:p>
+      <w:pPr>
+        <w:pStyle w:val="Ttulo3"/>
+        <w:rPr>
+          <w:rFonts w:ascii="Calibri" w:eastAsia="Times New Roman" w:hAnsi="Calibri" w:cs="Calibri"/>
+          <w:lang w:val="es-ES"/>
+        </w:rPr>
+      </w:pPr>
+      <w:r>
+        <w:rPr>
+          <w:rFonts w:ascii="Calibri" w:eastAsia="Times New Roman" w:hAnsi="Calibri" w:cs="Calibri"/>
+          <w:lang w:val="es-ES"/>
+        </w:rPr>
+        <w:t>15.0 Revisión de estados (respecto a §14)</w:t>
+      </w:r>
+    </w:p>
+    <w:tbl>
+      <w:tblPr>
+        <w:tblW w:w="5000" w:type="pct"/>
+        <w:tblCellMar>
+          <w:top w:w="15" w:type="dxa"/>
+          <w:left w:w="15" w:type="dxa"/>
+          <w:bottom w:w="15" w:type="dxa"/>
+          <w:right w:w="15" w:type="dxa"/>
+        </w:tblCellMar>
+        <w:tblLook w:val="04A0" w:firstRow="1" w:lastRow="0" w:firstColumn="1" w:lastColumn="0" w:noHBand="0" w:noVBand="1"/>
+      </w:tblPr>
+      <w:tblGrid>
+        <w:gridCol w:w="2479"/>
+        <w:gridCol w:w="1515"/>
+        <w:gridCol w:w="4494"/>
+      </w:tblGrid>
+      <w:tr>
+        <w:tc>
+          <w:tcPr>
+            <w:tcW w:w="0" w:type="auto"/>
+            <w:tcBorders>
+              <w:top w:val="single" w:sz="6" w:space="0" w:color="888888"/>
+              <w:left w:val="single" w:sz="6" w:space="0" w:color="888888"/>
+              <w:bottom w:val="single" w:sz="6" w:space="0" w:color="888888"/>
+              <w:right w:val="single" w:sz="6" w:space="0" w:color="888888"/>
+            </w:tcBorders>
+            <w:shd w:val="clear" w:color="auto" w:fill="1A3C6E"/>
+            <w:tcMar>
+              <w:top w:w="90" w:type="dxa"/>
+              <w:left w:w="120" w:type="dxa"/>
+              <w:bottom w:w="90" w:type="dxa"/>
+              <w:right w:w="120" w:type="dxa"/>
+            </w:tcMar>
+            <w:vAlign w:val="center"/>
+            <w:hideMark/>
+          </w:tcPr>
+          <w:p>
+            <w:pPr>
+              <w:spacing w:before="150" w:after="150"/>
+              <w:rPr>
+                <w:rFonts w:ascii="Calibri" w:eastAsia="Times New Roman" w:hAnsi="Calibri" w:cs="Calibri"/>
+                <w:b/>
+                <w:bCs/>
+                <w:color w:val="FFFFFF"/>
+                <w:sz w:val="20"/>
+                <w:szCs w:val="20"/>
+              </w:rPr>
+            </w:pPr>
+            <w:r>
+              <w:rPr>
+                <w:rFonts w:ascii="Calibri" w:eastAsia="Times New Roman" w:hAnsi="Calibri" w:cs="Calibri"/>
+                <w:b/>
+                <w:bCs/>
+                <w:color w:val="FFFFFF"/>
+                <w:sz w:val="20"/>
+                <w:szCs w:val="20"/>
+              </w:rPr>
+              <w:t>Ítem</w:t>
+            </w:r>
+          </w:p>
+        </w:tc>
+        <w:tc>
+          <w:tcPr>
+            <w:tcW w:w="0" w:type="auto"/>
+            <w:tcBorders>
+              <w:top w:val="single" w:sz="6" w:space="0" w:color="888888"/>
+              <w:left w:val="single" w:sz="6" w:space="0" w:color="888888"/>
+              <w:bottom w:val="single" w:sz="6" w:space="0" w:color="888888"/>
+              <w:right w:val="single" w:sz="6" w:space="0" w:color="888888"/>
+            </w:tcBorders>
+            <w:shd w:val="clear" w:color="auto" w:fill="1A3C6E"/>
+            <w:tcMar>
+              <w:top w:w="90" w:type="dxa"/>
+              <w:left w:w="120" w:type="dxa"/>
+              <w:bottom w:w="90" w:type="dxa"/>
+              <w:right w:w="120" w:type="dxa"/>
+            </w:tcMar>
+            <w:vAlign w:val="center"/>
+            <w:hideMark/>
+          </w:tcPr>
+          <w:p>
+            <w:pPr>
+              <w:spacing w:before="150" w:after="150"/>
+              <w:rPr>
+                <w:rFonts w:ascii="Calibri" w:eastAsia="Times New Roman" w:hAnsi="Calibri" w:cs="Calibri"/>
+                <w:b/>
+                <w:bCs/>
+                <w:color w:val="FFFFFF"/>
+                <w:sz w:val="20"/>
+                <w:szCs w:val="20"/>
+              </w:rPr>
+            </w:pPr>
+            <w:r>
+              <w:rPr>
+                <w:rFonts w:ascii="Calibri" w:eastAsia="Times New Roman" w:hAnsi="Calibri" w:cs="Calibri"/>
+                <w:b/>
+                <w:bCs/>
+                <w:color w:val="FFFFFF"/>
+                <w:sz w:val="20"/>
+                <w:szCs w:val="20"/>
+              </w:rPr>
+              <w:t>Estado §14</w:t>
+            </w:r>
+          </w:p>
+        </w:tc>
+        <w:tc>
+          <w:tcPr>
+            <w:tcW w:w="0" w:type="auto"/>
+            <w:tcBorders>
+              <w:top w:val="single" w:sz="6" w:space="0" w:color="888888"/>
+              <w:left w:val="single" w:sz="6" w:space="0" w:color="888888"/>
+              <w:bottom w:val="single" w:sz="6" w:space="0" w:color="888888"/>
+              <w:right w:val="single" w:sz="6" w:space="0" w:color="888888"/>
+            </w:tcBorders>
+            <w:shd w:val="clear" w:color="auto" w:fill="1A3C6E"/>
+            <w:tcMar>
+              <w:top w:w="90" w:type="dxa"/>
+              <w:left w:w="120" w:type="dxa"/>
+              <w:bottom w:w="90" w:type="dxa"/>
+              <w:right w:w="120" w:type="dxa"/>
+            </w:tcMar>
+            <w:vAlign w:val="center"/>
+            <w:hideMark/>
+          </w:tcPr>
+          <w:p>
+            <w:pPr>
+              <w:spacing w:before="150" w:after="150"/>
+              <w:rPr>
+                <w:rFonts w:ascii="Calibri" w:eastAsia="Times New Roman" w:hAnsi="Calibri" w:cs="Calibri"/>
+                <w:b/>
+                <w:bCs/>
+                <w:color w:val="FFFFFF"/>
+                <w:sz w:val="20"/>
+                <w:szCs w:val="20"/>
+              </w:rPr>
+            </w:pPr>
+            <w:r>
+              <w:rPr>
+                <w:rFonts w:ascii="Calibri" w:eastAsia="Times New Roman" w:hAnsi="Calibri" w:cs="Calibri"/>
+                <w:b/>
+                <w:bCs/>
+                <w:color w:val="FFFFFF"/>
+                <w:sz w:val="20"/>
+                <w:szCs w:val="20"/>
+              </w:rPr>
+              <w:t>Estado actual</w:t>
+            </w:r>
+          </w:p>
+        </w:tc>
+      </w:tr>
+      <w:tr>
+        <w:tc>
+          <w:tcPr>
+            <w:tcW w:w="0" w:type="auto"/>
+            <w:tcBorders>
+              <w:top w:val="single" w:sz="6" w:space="0" w:color="BBBBBB"/>
+              <w:left w:val="single" w:sz="6" w:space="0" w:color="BBBBBB"/>
+              <w:bottom w:val="single" w:sz="6" w:space="0" w:color="BBBBBB"/>
+              <w:right w:val="single" w:sz="6" w:space="0" w:color="BBBBBB"/>
+            </w:tcBorders>
+            <w:tcMar>
+              <w:top w:w="75" w:type="dxa"/>
+              <w:left w:w="120" w:type="dxa"/>
+              <w:bottom w:w="75" w:type="dxa"/>
+              <w:right w:w="120" w:type="dxa"/>
+            </w:tcMar>
+            <w:hideMark/>
+          </w:tcPr>
+          <w:p>
+            <w:pPr>
+              <w:spacing w:before="150" w:after="150"/>
+              <w:rPr>
+                <w:rFonts w:ascii="Calibri" w:eastAsia="Times New Roman" w:hAnsi="Calibri" w:cs="Calibri"/>
+                <w:color w:val="1A1A1A"/>
+                <w:sz w:val="20"/>
+                <w:szCs w:val="20"/>
+              </w:rPr>
+            </w:pPr>
+            <w:r>
+              <w:rPr>
+                <w:rFonts w:ascii="Calibri" w:eastAsia="Times New Roman" w:hAnsi="Calibri" w:cs="Calibri"/>
+                <w:color w:val="1A1A1A"/>
+                <w:sz w:val="20"/>
+                <w:szCs w:val="20"/>
+              </w:rPr>
+              <w:t>RF-29 SP seguimiento</w:t>
+            </w:r>
+          </w:p>
+        </w:tc>
+        <w:tc>
+          <w:tcPr>
+            <w:tcW w:w="0" w:type="auto"/>
+            <w:tcBorders>
+              <w:top w:val="single" w:sz="6" w:space="0" w:color="BBBBBB"/>
+              <w:left w:val="single" w:sz="6" w:space="0" w:color="BBBBBB"/>
+              <w:bottom w:val="single" w:sz="6" w:space="0" w:color="BBBBBB"/>
+              <w:right w:val="single" w:sz="6" w:space="0" w:color="BBBBBB"/>
+            </w:tcBorders>
+            <w:tcMar>
+              <w:top w:w="75" w:type="dxa"/>
+              <w:left w:w="120" w:type="dxa"/>
+              <w:bottom w:w="75" w:type="dxa"/>
+              <w:right w:w="120" w:type="dxa"/>
+            </w:tcMar>
+            <w:hideMark/>
+          </w:tcPr>
+          <w:p>
+            <w:pPr>
+              <w:spacing w:before="150" w:after="150"/>
+              <w:rPr>
+                <w:rFonts w:ascii="Calibri" w:eastAsia="Times New Roman" w:hAnsi="Calibri" w:cs="Calibri"/>
+                <w:b/>
+                <w:bCs/>
+                <w:color w:val="9A6700"/>
+                <w:sz w:val="20"/>
+                <w:szCs w:val="20"/>
+              </w:rPr>
+            </w:pPr>
+            <w:r>
+              <w:rPr>
+                <w:rFonts w:ascii="Calibri" w:eastAsia="Times New Roman" w:hAnsi="Calibri" w:cs="Calibri"/>
+                <w:b/>
+                <w:bCs/>
+                <w:color w:val="9A6700"/>
+                <w:sz w:val="20"/>
+                <w:szCs w:val="20"/>
+              </w:rPr>
+              <w:t>Parcial</w:t>
+            </w:r>
+          </w:p>
+        </w:tc>
+        <w:tc>
+          <w:tcPr>
+            <w:tcW w:w="0" w:type="auto"/>
+            <w:tcBorders>
+              <w:top w:val="single" w:sz="6" w:space="0" w:color="BBBBBB"/>
+              <w:left w:val="single" w:sz="6" w:space="0" w:color="BBBBBB"/>
+              <w:bottom w:val="single" w:sz="6" w:space="0" w:color="BBBBBB"/>
+              <w:right w:val="single" w:sz="6" w:space="0" w:color="BBBBBB"/>
+            </w:tcBorders>
+            <w:tcMar>
+              <w:top w:w="75" w:type="dxa"/>
+              <w:left w:w="120" w:type="dxa"/>
+              <w:bottom w:w="75" w:type="dxa"/>
+              <w:right w:w="120" w:type="dxa"/>
+            </w:tcMar>
+            <w:hideMark/>
+          </w:tcPr>
+          <w:p>
+            <w:pPr>
+              <w:spacing w:before="150" w:after="150"/>
+              <w:rPr>
+                <w:rFonts w:ascii="Calibri" w:eastAsia="Times New Roman" w:hAnsi="Calibri" w:cs="Calibri"/>
+                <w:b/>
+                <w:bCs/>
+                <w:color w:val="9A6700"/>
+                <w:sz w:val="20"/>
+                <w:szCs w:val="20"/>
+              </w:rPr>
+            </w:pPr>
+            <w:r>
+              <w:rPr>
+                <w:rStyle w:val="Fuerte"/>
+                <w:rFonts w:ascii="Calibri" w:eastAsia="Times New Roman" w:hAnsi="Calibri" w:cs="Calibri"/>
+                <w:color w:val="9A6700"/>
+                <w:sz w:val="20"/>
+                <w:szCs w:val="20"/>
+              </w:rPr>
+              <w:t>Parcial+</w:t>
+            </w:r>
+            <w:r>
+              <w:rPr>
+                <w:rFonts w:ascii="Calibri" w:eastAsia="Times New Roman" w:hAnsi="Calibri" w:cs="Calibri"/>
+                <w:b/>
+                <w:bCs/>
+                <w:color w:val="9A6700"/>
+                <w:sz w:val="20"/>
+                <w:szCs w:val="20"/>
+              </w:rPr>
+              <w:t xml:space="preserve"> — SP lectura historial + últimos</w:t>
+            </w:r>
+          </w:p>
+        </w:tc>
+      </w:tr>
+      <w:tr>
+        <w:tc>
+          <w:tcPr>
+            <w:tcW w:w="0" w:type="auto"/>
+            <w:tcBorders>
+              <w:top w:val="single" w:sz="6" w:space="0" w:color="BBBBBB"/>
+              <w:left w:val="single" w:sz="6" w:space="0" w:color="BBBBBB"/>
+              <w:bottom w:val="single" w:sz="6" w:space="0" w:color="BBBBBB"/>
+              <w:right w:val="single" w:sz="6" w:space="0" w:color="BBBBBB"/>
+            </w:tcBorders>
+            <w:tcMar>
+              <w:top w:w="75" w:type="dxa"/>
+              <w:left w:w="120" w:type="dxa"/>
+              <w:bottom w:w="75" w:type="dxa"/>
+              <w:right w:w="120" w:type="dxa"/>
+            </w:tcMar>
+            <w:hideMark/>
+          </w:tcPr>
+          <w:p>
+            <w:pPr>
+              <w:spacing w:before="150" w:after="150"/>
+              <w:rPr>
+                <w:rFonts w:ascii="Calibri" w:eastAsia="Times New Roman" w:hAnsi="Calibri" w:cs="Calibri"/>
+                <w:color w:val="1A1A1A"/>
+                <w:sz w:val="20"/>
+                <w:szCs w:val="20"/>
+              </w:rPr>
+            </w:pPr>
+            <w:r>
+              <w:rPr>
+                <w:rFonts w:ascii="Calibri" w:eastAsia="Times New Roman" w:hAnsi="Calibri" w:cs="Calibri"/>
+                <w:color w:val="1A1A1A"/>
+                <w:sz w:val="20"/>
+                <w:szCs w:val="20"/>
+              </w:rPr>
+              <w:t>RF-30 Historial</w:t>
+            </w:r>
+          </w:p>
+        </w:tc>
+        <w:tc>
+          <w:tcPr>
+            <w:tcW w:w="0" w:type="auto"/>
+            <w:tcBorders>
+              <w:top w:val="single" w:sz="6" w:space="0" w:color="BBBBBB"/>
+              <w:left w:val="single" w:sz="6" w:space="0" w:color="BBBBBB"/>
+              <w:bottom w:val="single" w:sz="6" w:space="0" w:color="BBBBBB"/>
+              <w:right w:val="single" w:sz="6" w:space="0" w:color="BBBBBB"/>
+            </w:tcBorders>
+            <w:tcMar>
+              <w:top w:w="75" w:type="dxa"/>
+              <w:left w:w="120" w:type="dxa"/>
+              <w:bottom w:w="75" w:type="dxa"/>
+              <w:right w:w="120" w:type="dxa"/>
+            </w:tcMar>
+            <w:hideMark/>
+          </w:tcPr>
+          <w:p>
+            <w:pPr>
+              <w:spacing w:before="150" w:after="150"/>
+              <w:rPr>
+                <w:rFonts w:ascii="Calibri" w:eastAsia="Times New Roman" w:hAnsi="Calibri" w:cs="Calibri"/>
+                <w:b/>
+                <w:bCs/>
+                <w:color w:val="0D6B2E"/>
+                <w:sz w:val="20"/>
+                <w:szCs w:val="20"/>
+              </w:rPr>
+            </w:pPr>
+            <w:r>
+              <w:rPr>
+                <w:rFonts w:ascii="Calibri" w:eastAsia="Times New Roman" w:hAnsi="Calibri" w:cs="Calibri"/>
+                <w:b/>
+                <w:bCs/>
+                <w:color w:val="0D6B2E"/>
+                <w:sz w:val="20"/>
+                <w:szCs w:val="20"/>
+              </w:rPr>
+              <w:t>Implementado</w:t>
+            </w:r>
+          </w:p>
+        </w:tc>
+        <w:tc>
+          <w:tcPr>
+            <w:tcW w:w="0" w:type="auto"/>
+            <w:tcBorders>
+              <w:top w:val="single" w:sz="6" w:space="0" w:color="BBBBBB"/>
+              <w:left w:val="single" w:sz="6" w:space="0" w:color="BBBBBB"/>
+              <w:bottom w:val="single" w:sz="6" w:space="0" w:color="BBBBBB"/>
+              <w:right w:val="single" w:sz="6" w:space="0" w:color="BBBBBB"/>
+            </w:tcBorders>
+            <w:tcMar>
+              <w:top w:w="75" w:type="dxa"/>
+              <w:left w:w="120" w:type="dxa"/>
+              <w:bottom w:w="75" w:type="dxa"/>
+              <w:right w:w="120" w:type="dxa"/>
+            </w:tcMar>
+            <w:hideMark/>
+          </w:tcPr>
+          <w:p>
+            <w:pPr>
+              <w:spacing w:before="150" w:after="150"/>
+              <w:rPr>
+                <w:rFonts w:ascii="Calibri" w:eastAsia="Times New Roman" w:hAnsi="Calibri" w:cs="Calibri"/>
+                <w:b/>
+                <w:bCs/>
+                <w:color w:val="0D6B2E"/>
+                <w:sz w:val="20"/>
+                <w:szCs w:val="20"/>
+              </w:rPr>
+            </w:pPr>
+            <w:r>
+              <w:rPr>
+                <w:rStyle w:val="Fuerte"/>
+                <w:rFonts w:ascii="Calibri" w:eastAsia="Times New Roman" w:hAnsi="Calibri" w:cs="Calibri"/>
+                <w:color w:val="0D6B2E"/>
+                <w:sz w:val="20"/>
+                <w:szCs w:val="20"/>
+              </w:rPr>
+              <w:t>Implementado+</w:t>
+            </w:r>
+            <w:r>
+              <w:rPr>
+                <w:rFonts w:ascii="Calibri" w:eastAsia="Times New Roman" w:hAnsi="Calibri" w:cs="Calibri"/>
+                <w:b/>
+                <w:bCs/>
+                <w:color w:val="0D6B2E"/>
+                <w:sz w:val="20"/>
+                <w:szCs w:val="20"/>
+              </w:rPr>
+              <w:t xml:space="preserve"> — inline en tarjetas</w:t>
+            </w:r>
+          </w:p>
+        </w:tc>
+      </w:tr>
+      <w:tr>
+        <w:tc>
+          <w:tcPr>
+            <w:tcW w:w="0" w:type="auto"/>
+            <w:tcBorders>
+              <w:top w:val="single" w:sz="6" w:space="0" w:color="BBBBBB"/>
+              <w:left w:val="single" w:sz="6" w:space="0" w:color="BBBBBB"/>
+              <w:bottom w:val="single" w:sz="6" w:space="0" w:color="BBBBBB"/>
+              <w:right w:val="single" w:sz="6" w:space="0" w:color="BBBBBB"/>
+            </w:tcBorders>
+            <w:tcMar>
+              <w:top w:w="75" w:type="dxa"/>
+              <w:left w:w="120" w:type="dxa"/>
+              <w:bottom w:w="75" w:type="dxa"/>
+              <w:right w:w="120" w:type="dxa"/>
+            </w:tcMar>
+            <w:hideMark/>
+          </w:tcPr>
+          <w:p>
+            <w:pPr>
+              <w:spacing w:before="150" w:after="150"/>
+              <w:rPr>
+                <w:rFonts w:ascii="Calibri" w:eastAsia="Times New Roman" w:hAnsi="Calibri" w:cs="Calibri"/>
+                <w:color w:val="1A1A1A"/>
+                <w:sz w:val="20"/>
+                <w:szCs w:val="20"/>
+              </w:rPr>
+            </w:pPr>
+            <w:r>
+              <w:rPr>
+                <w:rFonts w:ascii="Calibri" w:eastAsia="Times New Roman" w:hAnsi="Calibri" w:cs="Calibri"/>
+                <w:color w:val="1A1A1A"/>
+                <w:sz w:val="20"/>
+                <w:szCs w:val="20"/>
+              </w:rPr>
+              <w:t>RF-31 Referidos</w:t>
+            </w:r>
+          </w:p>
+        </w:tc>
+        <w:tc>
+          <w:tcPr>
+            <w:tcW w:w="0" w:type="auto"/>
+            <w:tcBorders>
+              <w:top w:val="single" w:sz="6" w:space="0" w:color="BBBBBB"/>
+              <w:left w:val="single" w:sz="6" w:space="0" w:color="BBBBBB"/>
+              <w:bottom w:val="single" w:sz="6" w:space="0" w:color="BBBBBB"/>
+              <w:right w:val="single" w:sz="6" w:space="0" w:color="BBBBBB"/>
+            </w:tcBorders>
+            <w:tcMar>
+              <w:top w:w="75" w:type="dxa"/>
+              <w:left w:w="120" w:type="dxa"/>
+              <w:bottom w:w="75" w:type="dxa"/>
+              <w:right w:w="120" w:type="dxa"/>
+            </w:tcMar>
+            <w:hideMark/>
+          </w:tcPr>
+          <w:p>
+            <w:pPr>
+              <w:spacing w:before="150" w:after="150"/>
+              <w:rPr>
+                <w:rFonts w:ascii="Calibri" w:eastAsia="Times New Roman" w:hAnsi="Calibri" w:cs="Calibri"/>
+                <w:b/>
+                <w:bCs/>
+                <w:color w:val="9A6700"/>
+                <w:sz w:val="20"/>
+                <w:szCs w:val="20"/>
+              </w:rPr>
+            </w:pPr>
+            <w:r>
+              <w:rPr>
+                <w:rFonts w:ascii="Calibri" w:eastAsia="Times New Roman" w:hAnsi="Calibri" w:cs="Calibri"/>
+                <w:b/>
+                <w:bCs/>
+                <w:color w:val="9A6700"/>
+                <w:sz w:val="20"/>
+                <w:szCs w:val="20"/>
+              </w:rPr>
+              <w:t>Parcial</w:t>
+            </w:r>
+          </w:p>
+        </w:tc>
+        <w:tc>
+          <w:tcPr>
+            <w:tcW w:w="0" w:type="auto"/>
+            <w:tcBorders>
+              <w:top w:val="single" w:sz="6" w:space="0" w:color="BBBBBB"/>
+              <w:left w:val="single" w:sz="6" w:space="0" w:color="BBBBBB"/>
+              <w:bottom w:val="single" w:sz="6" w:space="0" w:color="BBBBBB"/>
+              <w:right w:val="single" w:sz="6" w:space="0" w:color="BBBBBB"/>
+            </w:tcBorders>
+            <w:tcMar>
+              <w:top w:w="75" w:type="dxa"/>
+              <w:left w:w="120" w:type="dxa"/>
+              <w:bottom w:w="75" w:type="dxa"/>
+              <w:right w:w="120" w:type="dxa"/>
+            </w:tcMar>
+            <w:hideMark/>
+          </w:tcPr>
+          <w:p>
+            <w:pPr>
+              <w:spacing w:before="150" w:after="150"/>
+              <w:rPr>
+                <w:rFonts w:ascii="Calibri" w:eastAsia="Times New Roman" w:hAnsi="Calibri" w:cs="Calibri"/>
+                <w:b/>
+                <w:bCs/>
+                <w:color w:val="9A6700"/>
+                <w:sz w:val="20"/>
+                <w:szCs w:val="20"/>
+              </w:rPr>
+            </w:pPr>
+            <w:r>
+              <w:rPr>
+                <w:rStyle w:val="Fuerte"/>
+                <w:rFonts w:ascii="Calibri" w:eastAsia="Times New Roman" w:hAnsi="Calibri" w:cs="Calibri"/>
+                <w:color w:val="9A6700"/>
+                <w:sz w:val="20"/>
+                <w:szCs w:val="20"/>
+              </w:rPr>
+              <w:t>Parcial+</w:t>
+            </w:r>
+            <w:r>
+              <w:rPr>
+                <w:rFonts w:ascii="Calibri" w:eastAsia="Times New Roman" w:hAnsi="Calibri" w:cs="Calibri"/>
+                <w:b/>
+                <w:bCs/>
+                <w:color w:val="9A6700"/>
+                <w:sz w:val="20"/>
+                <w:szCs w:val="20"/>
+              </w:rPr>
+              <w:t xml:space="preserve"> — badge Referido, fix campo3/4</w:t>
+            </w:r>
+          </w:p>
+        </w:tc>
+      </w:tr>
+      <w:tr>
+        <w:tc>
+          <w:tcPr>
+            <w:tcW w:w="0" w:type="auto"/>
+            <w:tcBorders>
+              <w:top w:val="single" w:sz="6" w:space="0" w:color="BBBBBB"/>
+              <w:left w:val="single" w:sz="6" w:space="0" w:color="BBBBBB"/>
+              <w:bottom w:val="single" w:sz="6" w:space="0" w:color="BBBBBB"/>
+              <w:right w:val="single" w:sz="6" w:space="0" w:color="BBBBBB"/>
+            </w:tcBorders>
+            <w:tcMar>
+              <w:top w:w="75" w:type="dxa"/>
+              <w:left w:w="120" w:type="dxa"/>
+              <w:bottom w:w="75" w:type="dxa"/>
+              <w:right w:w="120" w:type="dxa"/>
+            </w:tcMar>
+            <w:hideMark/>
+          </w:tcPr>
+          <w:p>
+            <w:pPr>
+              <w:spacing w:before="150" w:after="150"/>
+              <w:rPr>
+                <w:rFonts w:ascii="Calibri" w:eastAsia="Times New Roman" w:hAnsi="Calibri" w:cs="Calibri"/>
+                <w:color w:val="1A1A1A"/>
+                <w:sz w:val="20"/>
+                <w:szCs w:val="20"/>
+              </w:rPr>
+            </w:pPr>
+            <w:r>
+              <w:rPr>
+                <w:rFonts w:ascii="Calibri" w:eastAsia="Times New Roman" w:hAnsi="Calibri" w:cs="Calibri"/>
+                <w:color w:val="1A1A1A"/>
+                <w:sz w:val="20"/>
+                <w:szCs w:val="20"/>
+              </w:rPr>
+              <w:t>RF-34 Links redes</w:t>
+            </w:r>
+          </w:p>
+        </w:tc>
+        <w:tc>
+          <w:tcPr>
+            <w:tcW w:w="0" w:type="auto"/>
+            <w:tcBorders>
+              <w:top w:val="single" w:sz="6" w:space="0" w:color="BBBBBB"/>
+              <w:left w:val="single" w:sz="6" w:space="0" w:color="BBBBBB"/>
+              <w:bottom w:val="single" w:sz="6" w:space="0" w:color="BBBBBB"/>
+              <w:right w:val="single" w:sz="6" w:space="0" w:color="BBBBBB"/>
+            </w:tcBorders>
+            <w:tcMar>
+              <w:top w:w="75" w:type="dxa"/>
+              <w:left w:w="120" w:type="dxa"/>
+              <w:bottom w:w="75" w:type="dxa"/>
+              <w:right w:w="120" w:type="dxa"/>
+            </w:tcMar>
+            <w:hideMark/>
+          </w:tcPr>
+          <w:p>
+            <w:pPr>
+              <w:spacing w:before="150" w:after="150"/>
+              <w:rPr>
+                <w:rFonts w:ascii="Calibri" w:eastAsia="Times New Roman" w:hAnsi="Calibri" w:cs="Calibri"/>
+                <w:b/>
+                <w:bCs/>
+                <w:color w:val="0D6B2E"/>
+                <w:sz w:val="20"/>
+                <w:szCs w:val="20"/>
+              </w:rPr>
+            </w:pPr>
+            <w:r>
+              <w:rPr>
+                <w:rFonts w:ascii="Calibri" w:eastAsia="Times New Roman" w:hAnsi="Calibri" w:cs="Calibri"/>
+                <w:b/>
+                <w:bCs/>
+                <w:color w:val="0D6B2E"/>
+                <w:sz w:val="20"/>
+                <w:szCs w:val="20"/>
+              </w:rPr>
+              <w:t>Implementado</w:t>
+            </w:r>
+          </w:p>
+        </w:tc>
+        <w:tc>
+          <w:tcPr>
+            <w:tcW w:w="0" w:type="auto"/>
+            <w:tcBorders>
+              <w:top w:val="single" w:sz="6" w:space="0" w:color="BBBBBB"/>
+              <w:left w:val="single" w:sz="6" w:space="0" w:color="BBBBBB"/>
+              <w:bottom w:val="single" w:sz="6" w:space="0" w:color="BBBBBB"/>
+              <w:right w:val="single" w:sz="6" w:space="0" w:color="BBBBBB"/>
+            </w:tcBorders>
+            <w:tcMar>
+              <w:top w:w="75" w:type="dxa"/>
+              <w:left w:w="120" w:type="dxa"/>
+              <w:bottom w:w="75" w:type="dxa"/>
+              <w:right w:w="120" w:type="dxa"/>
+            </w:tcMar>
+            <w:hideMark/>
+          </w:tcPr>
+          <w:p>
+            <w:pPr>
+              <w:spacing w:before="150" w:after="150"/>
+              <w:rPr>
+                <w:rFonts w:ascii="Calibri" w:eastAsia="Times New Roman" w:hAnsi="Calibri" w:cs="Calibri"/>
+                <w:b/>
+                <w:bCs/>
+                <w:color w:val="0D6B2E"/>
+                <w:sz w:val="20"/>
+                <w:szCs w:val="20"/>
+              </w:rPr>
+            </w:pPr>
+            <w:r>
+              <w:rPr>
+                <w:rStyle w:val="Fuerte"/>
+                <w:rFonts w:ascii="Calibri" w:eastAsia="Times New Roman" w:hAnsi="Calibri" w:cs="Calibri"/>
+                <w:color w:val="0D6B2E"/>
+                <w:sz w:val="20"/>
+                <w:szCs w:val="20"/>
+              </w:rPr>
+              <w:t>Implementado+</w:t>
+            </w:r>
+            <w:r>
+              <w:rPr>
+                <w:rFonts w:ascii="Calibri" w:eastAsia="Times New Roman" w:hAnsi="Calibri" w:cs="Calibri"/>
+                <w:b/>
+                <w:bCs/>
+                <w:color w:val="0D6B2E"/>
+                <w:sz w:val="20"/>
+                <w:szCs w:val="20"/>
+              </w:rPr>
+              <w:t xml:space="preserve"> — catálogo desde SP STRSYSTEM</w:t>
+            </w:r>
+          </w:p>
+        </w:tc>
+      </w:tr>
+      <w:tr>
+        <w:tc>
+          <w:tcPr>
+            <w:tcW w:w="0" w:type="auto"/>
+            <w:tcBorders>
+              <w:top w:val="single" w:sz="6" w:space="0" w:color="BBBBBB"/>
+              <w:left w:val="single" w:sz="6" w:space="0" w:color="BBBBBB"/>
+              <w:bottom w:val="single" w:sz="6" w:space="0" w:color="BBBBBB"/>
+              <w:right w:val="single" w:sz="6" w:space="0" w:color="BBBBBB"/>
+            </w:tcBorders>
+            <w:tcMar>
+              <w:top w:w="75" w:type="dxa"/>
+              <w:left w:w="120" w:type="dxa"/>
+              <w:bottom w:w="75" w:type="dxa"/>
+              <w:right w:w="120" w:type="dxa"/>
+            </w:tcMar>
+            <w:hideMark/>
+          </w:tcPr>
+          <w:p>
+            <w:pPr>
+              <w:spacing w:before="150" w:after="150"/>
+              <w:rPr>
+                <w:rFonts w:ascii="Calibri" w:eastAsia="Times New Roman" w:hAnsi="Calibri" w:cs="Calibri"/>
+                <w:color w:val="1A1A1A"/>
+                <w:sz w:val="20"/>
+                <w:szCs w:val="20"/>
+              </w:rPr>
+            </w:pPr>
+            <w:r>
+              <w:rPr>
+                <w:rFonts w:ascii="Calibri" w:eastAsia="Times New Roman" w:hAnsi="Calibri" w:cs="Calibri"/>
+                <w:color w:val="1A1A1A"/>
+                <w:sz w:val="20"/>
+                <w:szCs w:val="20"/>
+              </w:rPr>
+              <w:t>DBA ítem 12 lead_referido</w:t>
+            </w:r>
+          </w:p>
+        </w:tc>
+        <w:tc>
+          <w:tcPr>
+            <w:tcW w:w="0" w:type="auto"/>
+            <w:tcBorders>
+              <w:top w:val="single" w:sz="6" w:space="0" w:color="BBBBBB"/>
+              <w:left w:val="single" w:sz="6" w:space="0" w:color="BBBBBB"/>
+              <w:bottom w:val="single" w:sz="6" w:space="0" w:color="BBBBBB"/>
+              <w:right w:val="single" w:sz="6" w:space="0" w:color="BBBBBB"/>
+            </w:tcBorders>
+            <w:tcMar>
+              <w:top w:w="75" w:type="dxa"/>
+              <w:left w:w="120" w:type="dxa"/>
+              <w:bottom w:w="75" w:type="dxa"/>
+              <w:right w:w="120" w:type="dxa"/>
+            </w:tcMar>
+            <w:hideMark/>
+          </w:tcPr>
+          <w:p>
+            <w:pPr>
+              <w:spacing w:before="150" w:after="150"/>
+              <w:rPr>
+                <w:rFonts w:ascii="Calibri" w:eastAsia="Times New Roman" w:hAnsi="Calibri" w:cs="Calibri"/>
+                <w:b/>
+                <w:bCs/>
+                <w:color w:val="B42318"/>
+                <w:sz w:val="20"/>
+                <w:szCs w:val="20"/>
+              </w:rPr>
+            </w:pPr>
+            <w:r>
+              <w:rPr>
+                <w:rFonts w:ascii="Calibri" w:eastAsia="Times New Roman" w:hAnsi="Calibri" w:cs="Calibri"/>
+                <w:b/>
+                <w:bCs/>
+                <w:color w:val="B42318"/>
+                <w:sz w:val="20"/>
+                <w:szCs w:val="20"/>
+              </w:rPr>
+              <w:t>Pendiente</w:t>
+            </w:r>
+          </w:p>
+        </w:tc>
+        <w:tc>
+          <w:tcPr>
+            <w:tcW w:w="0" w:type="auto"/>
+            <w:tcBorders>
+              <w:top w:val="single" w:sz="6" w:space="0" w:color="BBBBBB"/>
+              <w:left w:val="single" w:sz="6" w:space="0" w:color="BBBBBB"/>
+              <w:bottom w:val="single" w:sz="6" w:space="0" w:color="BBBBBB"/>
+              <w:right w:val="single" w:sz="6" w:space="0" w:color="BBBBBB"/>
+            </w:tcBorders>
+            <w:tcMar>
+              <w:top w:w="75" w:type="dxa"/>
+              <w:left w:w="120" w:type="dxa"/>
+              <w:bottom w:w="75" w:type="dxa"/>
+              <w:right w:w="120" w:type="dxa"/>
+            </w:tcMar>
+            <w:hideMark/>
+          </w:tcPr>
+          <w:p>
+            <w:pPr>
+              <w:spacing w:before="150" w:after="150"/>
+              <w:rPr>
+                <w:rFonts w:ascii="Calibri" w:eastAsia="Times New Roman" w:hAnsi="Calibri" w:cs="Calibri"/>
+                <w:b/>
+                <w:bCs/>
+                <w:color w:val="9A6700"/>
+                <w:sz w:val="20"/>
+                <w:szCs w:val="20"/>
+              </w:rPr>
+            </w:pPr>
+            <w:r>
+              <w:rPr>
+                <w:rStyle w:val="Fuerte"/>
+                <w:rFonts w:ascii="Calibri" w:eastAsia="Times New Roman" w:hAnsi="Calibri" w:cs="Calibri"/>
+                <w:color w:val="9A6700"/>
+                <w:sz w:val="20"/>
+                <w:szCs w:val="20"/>
+              </w:rPr>
+              <w:t>Parcial</w:t>
+            </w:r>
+            <w:r>
+              <w:rPr>
+                <w:rFonts w:ascii="Calibri" w:eastAsia="Times New Roman" w:hAnsi="Calibri" w:cs="Calibri"/>
+                <w:b/>
+                <w:bCs/>
+                <w:color w:val="9A6700"/>
+                <w:sz w:val="20"/>
+                <w:szCs w:val="20"/>
+              </w:rPr>
+              <w:t xml:space="preserve"> — scripts + fix Pablo</w:t>
+            </w:r>
+          </w:p>
+        </w:tc>
+      </w:tr>
+    </w:tbl>
+    <w:p>
+      <w:pPr>
+        <w:pStyle w:val="Ttulo3"/>
+        <w:rPr>
+          <w:rFonts w:ascii="Calibri" w:eastAsia="Times New Roman" w:hAnsi="Calibri" w:cs="Calibri"/>
+          <w:lang w:val="es-ES"/>
+        </w:rPr>
+      </w:pPr>
+      <w:r>
+        <w:rPr>
+          <w:rFonts w:ascii="Calibri" w:eastAsia="Times New Roman" w:hAnsi="Calibri" w:cs="Calibri"/>
+          <w:lang w:val="es-ES"/>
+        </w:rPr>
+        <w:t>15.1 Nuevos requerimientos funcionales</w:t>
+      </w:r>
+    </w:p>
+    <w:tbl>
+      <w:tblPr>
+        <w:tblW w:w="5000" w:type="pct"/>
+        <w:tblCellMar>
+          <w:top w:w="15" w:type="dxa"/>
+          <w:left w:w="15" w:type="dxa"/>
+          <w:bottom w:w="15" w:type="dxa"/>
+          <w:right w:w="15" w:type="dxa"/>
+        </w:tblCellMar>
+        <w:tblLook w:val="04A0" w:firstRow="1" w:lastRow="0" w:firstColumn="1" w:lastColumn="0" w:noHBand="0" w:noVBand="1"/>
+      </w:tblPr>
+      <w:tblGrid>
+        <w:gridCol w:w="914"/>
+        <w:gridCol w:w="1903"/>
+        <w:gridCol w:w="5671"/>
+      </w:tblGrid>
+      <w:tr>
+        <w:tc>
+          <w:tcPr>
+            <w:tcW w:w="0" w:type="auto"/>
+            <w:tcBorders>
+              <w:top w:val="single" w:sz="6" w:space="0" w:color="888888"/>
+              <w:left w:val="single" w:sz="6" w:space="0" w:color="888888"/>
+              <w:bottom w:val="single" w:sz="6" w:space="0" w:color="888888"/>
+              <w:right w:val="single" w:sz="6" w:space="0" w:color="888888"/>
+            </w:tcBorders>
+            <w:shd w:val="clear" w:color="auto" w:fill="1A3C6E"/>
+            <w:tcMar>
+              <w:top w:w="90" w:type="dxa"/>
+              <w:left w:w="120" w:type="dxa"/>
+              <w:bottom w:w="90" w:type="dxa"/>
+              <w:right w:w="120" w:type="dxa"/>
+            </w:tcMar>
+            <w:vAlign w:val="center"/>
+            <w:hideMark/>
+          </w:tcPr>
+          <w:p>
+            <w:pPr>
+              <w:spacing w:before="150" w:after="150"/>
+              <w:rPr>
+                <w:rFonts w:ascii="Calibri" w:eastAsia="Times New Roman" w:hAnsi="Calibri" w:cs="Calibri"/>
+                <w:b/>
+                <w:bCs/>
+                <w:color w:val="FFFFFF"/>
+                <w:sz w:val="20"/>
+                <w:szCs w:val="20"/>
+              </w:rPr>
+            </w:pPr>
+            <w:r>
+              <w:rPr>
+                <w:rFonts w:ascii="Calibri" w:eastAsia="Times New Roman" w:hAnsi="Calibri" w:cs="Calibri"/>
+                <w:b/>
+                <w:bCs/>
+                <w:color w:val="FFFFFF"/>
+                <w:sz w:val="20"/>
+                <w:szCs w:val="20"/>
+              </w:rPr>
+              <w:t>ID</w:t>
+            </w:r>
+          </w:p>
+        </w:tc>
+        <w:tc>
+          <w:tcPr>
+            <w:tcW w:w="0" w:type="auto"/>
+            <w:tcBorders>
+              <w:top w:val="single" w:sz="6" w:space="0" w:color="888888"/>
+              <w:left w:val="single" w:sz="6" w:space="0" w:color="888888"/>
+              <w:bottom w:val="single" w:sz="6" w:space="0" w:color="888888"/>
+              <w:right w:val="single" w:sz="6" w:space="0" w:color="888888"/>
+            </w:tcBorders>
+            <w:shd w:val="clear" w:color="auto" w:fill="1A3C6E"/>
+            <w:tcMar>
+              <w:top w:w="90" w:type="dxa"/>
+              <w:left w:w="120" w:type="dxa"/>
+              <w:bottom w:w="90" w:type="dxa"/>
+              <w:right w:w="120" w:type="dxa"/>
+            </w:tcMar>
+            <w:vAlign w:val="center"/>
+            <w:hideMark/>
+          </w:tcPr>
+          <w:p>
+            <w:pPr>
+              <w:spacing w:before="150" w:after="150"/>
+              <w:rPr>
+                <w:rFonts w:ascii="Calibri" w:eastAsia="Times New Roman" w:hAnsi="Calibri" w:cs="Calibri"/>
+                <w:b/>
+                <w:bCs/>
+                <w:color w:val="FFFFFF"/>
+                <w:sz w:val="20"/>
+                <w:szCs w:val="20"/>
+              </w:rPr>
+            </w:pPr>
+            <w:r>
+              <w:rPr>
+                <w:rFonts w:ascii="Calibri" w:eastAsia="Times New Roman" w:hAnsi="Calibri" w:cs="Calibri"/>
+                <w:b/>
+                <w:bCs/>
+                <w:color w:val="FFFFFF"/>
+                <w:sz w:val="20"/>
+                <w:szCs w:val="20"/>
+              </w:rPr>
+              <w:t>Estado</w:t>
+            </w:r>
+          </w:p>
+        </w:tc>
+        <w:tc>
+          <w:tcPr>
+            <w:tcW w:w="0" w:type="auto"/>
+            <w:tcBorders>
+              <w:top w:val="single" w:sz="6" w:space="0" w:color="888888"/>
+              <w:left w:val="single" w:sz="6" w:space="0" w:color="888888"/>
+              <w:bottom w:val="single" w:sz="6" w:space="0" w:color="888888"/>
+              <w:right w:val="single" w:sz="6" w:space="0" w:color="888888"/>
+            </w:tcBorders>
+            <w:shd w:val="clear" w:color="auto" w:fill="1A3C6E"/>
+            <w:tcMar>
+              <w:top w:w="90" w:type="dxa"/>
+              <w:left w:w="120" w:type="dxa"/>
+              <w:bottom w:w="90" w:type="dxa"/>
+              <w:right w:w="120" w:type="dxa"/>
+            </w:tcMar>
+            <w:vAlign w:val="center"/>
+            <w:hideMark/>
+          </w:tcPr>
+          <w:p>
+            <w:pPr>
+              <w:spacing w:before="150" w:after="150"/>
+              <w:rPr>
+                <w:rFonts w:ascii="Calibri" w:eastAsia="Times New Roman" w:hAnsi="Calibri" w:cs="Calibri"/>
+                <w:b/>
+                <w:bCs/>
+                <w:color w:val="FFFFFF"/>
+                <w:sz w:val="20"/>
+                <w:szCs w:val="20"/>
+              </w:rPr>
+            </w:pPr>
+            <w:r>
+              <w:rPr>
+                <w:rFonts w:ascii="Calibri" w:eastAsia="Times New Roman" w:hAnsi="Calibri" w:cs="Calibri"/>
+                <w:b/>
+                <w:bCs/>
+                <w:color w:val="FFFFFF"/>
+                <w:sz w:val="20"/>
+                <w:szCs w:val="20"/>
+              </w:rPr>
+              <w:t>Requerimiento</w:t>
+            </w:r>
+          </w:p>
+        </w:tc>
+      </w:tr>
+      <w:tr>
+        <w:tc>
+          <w:tcPr>
+            <w:tcW w:w="0" w:type="auto"/>
+            <w:tcBorders>
+              <w:top w:val="single" w:sz="6" w:space="0" w:color="BBBBBB"/>
+              <w:left w:val="single" w:sz="6" w:space="0" w:color="BBBBBB"/>
+              <w:bottom w:val="single" w:sz="6" w:space="0" w:color="BBBBBB"/>
+              <w:right w:val="single" w:sz="6" w:space="0" w:color="BBBBBB"/>
+            </w:tcBorders>
+            <w:tcMar>
+              <w:top w:w="75" w:type="dxa"/>
+              <w:left w:w="120" w:type="dxa"/>
+              <w:bottom w:w="75" w:type="dxa"/>
+              <w:right w:w="120" w:type="dxa"/>
+            </w:tcMar>
+            <w:hideMark/>
+          </w:tcPr>
+          <w:p>
+            <w:pPr>
+              <w:spacing w:before="150" w:after="150"/>
+              <w:rPr>
+                <w:rFonts w:ascii="Calibri" w:eastAsia="Times New Roman" w:hAnsi="Calibri" w:cs="Calibri"/>
+                <w:color w:val="1A1A1A"/>
+                <w:sz w:val="20"/>
+                <w:szCs w:val="20"/>
+              </w:rPr>
+            </w:pPr>
+            <w:r>
+              <w:rPr>
+                <w:rFonts w:ascii="Calibri" w:eastAsia="Times New Roman" w:hAnsi="Calibri" w:cs="Calibri"/>
+                <w:color w:val="1A1A1A"/>
+                <w:sz w:val="20"/>
+                <w:szCs w:val="20"/>
+              </w:rPr>
+              <w:t>RF-37</w:t>
+            </w:r>
+          </w:p>
+        </w:tc>
+        <w:tc>
+          <w:tcPr>
+            <w:tcW w:w="0" w:type="auto"/>
+            <w:tcBorders>
+              <w:top w:val="single" w:sz="6" w:space="0" w:color="BBBBBB"/>
+              <w:left w:val="single" w:sz="6" w:space="0" w:color="BBBBBB"/>
+              <w:bottom w:val="single" w:sz="6" w:space="0" w:color="BBBBBB"/>
+              <w:right w:val="single" w:sz="6" w:space="0" w:color="BBBBBB"/>
+            </w:tcBorders>
+            <w:tcMar>
+              <w:top w:w="75" w:type="dxa"/>
+              <w:left w:w="120" w:type="dxa"/>
+              <w:bottom w:w="75" w:type="dxa"/>
+              <w:right w:w="120" w:type="dxa"/>
+            </w:tcMar>
+            <w:hideMark/>
+          </w:tcPr>
+          <w:p>
+            <w:pPr>
+              <w:spacing w:before="150" w:after="150"/>
+              <w:rPr>
+                <w:rFonts w:ascii="Calibri" w:eastAsia="Times New Roman" w:hAnsi="Calibri" w:cs="Calibri"/>
+                <w:b/>
+                <w:bCs/>
+                <w:color w:val="0D6B2E"/>
+                <w:sz w:val="20"/>
+                <w:szCs w:val="20"/>
+              </w:rPr>
+            </w:pPr>
+            <w:r>
+              <w:rPr>
+                <w:rFonts w:ascii="Calibri" w:eastAsia="Times New Roman" w:hAnsi="Calibri" w:cs="Calibri"/>
+                <w:b/>
+                <w:bCs/>
+                <w:color w:val="0D6B2E"/>
+                <w:sz w:val="20"/>
+                <w:szCs w:val="20"/>
+              </w:rPr>
+              <w:t>Implementado</w:t>
+            </w:r>
+          </w:p>
+        </w:tc>
+        <w:tc>
+          <w:tcPr>
+            <w:tcW w:w="0" w:type="auto"/>
+            <w:tcBorders>
+              <w:top w:val="single" w:sz="6" w:space="0" w:color="BBBBBB"/>
+              <w:left w:val="single" w:sz="6" w:space="0" w:color="BBBBBB"/>
+              <w:bottom w:val="single" w:sz="6" w:space="0" w:color="BBBBBB"/>
+              <w:right w:val="single" w:sz="6" w:space="0" w:color="BBBBBB"/>
+            </w:tcBorders>
+            <w:tcMar>
+              <w:top w:w="75" w:type="dxa"/>
+              <w:left w:w="120" w:type="dxa"/>
+              <w:bottom w:w="75" w:type="dxa"/>
+              <w:right w:w="120" w:type="dxa"/>
+            </w:tcMar>
+            <w:hideMark/>
+          </w:tcPr>
+          <w:p>
+            <w:pPr>
+              <w:spacing w:before="150" w:after="150"/>
+              <w:rPr>
+                <w:rFonts w:ascii="Calibri" w:eastAsia="Times New Roman" w:hAnsi="Calibri" w:cs="Calibri"/>
+                <w:color w:val="1A1A1A"/>
+                <w:sz w:val="20"/>
+                <w:szCs w:val="20"/>
+              </w:rPr>
+            </w:pPr>
+            <w:r>
+              <w:rPr>
+                <w:rFonts w:ascii="Calibri" w:eastAsia="Times New Roman" w:hAnsi="Calibri" w:cs="Calibri"/>
+                <w:color w:val="1A1A1A"/>
+                <w:sz w:val="20"/>
+                <w:szCs w:val="20"/>
+              </w:rPr>
+              <w:t>Historial inline en tarjeta del lead</w:t>
+            </w:r>
+          </w:p>
+        </w:tc>
+      </w:tr>
+      <w:tr>
+        <w:tc>
+          <w:tcPr>
+            <w:tcW w:w="0" w:type="auto"/>
+            <w:tcBorders>
+              <w:top w:val="single" w:sz="6" w:space="0" w:color="BBBBBB"/>
+              <w:left w:val="single" w:sz="6" w:space="0" w:color="BBBBBB"/>
+              <w:bottom w:val="single" w:sz="6" w:space="0" w:color="BBBBBB"/>
+              <w:right w:val="single" w:sz="6" w:space="0" w:color="BBBBBB"/>
+            </w:tcBorders>
+            <w:tcMar>
+              <w:top w:w="75" w:type="dxa"/>
+              <w:left w:w="120" w:type="dxa"/>
+              <w:bottom w:w="75" w:type="dxa"/>
+              <w:right w:w="120" w:type="dxa"/>
+            </w:tcMar>
+            <w:hideMark/>
+          </w:tcPr>
+          <w:p>
+            <w:pPr>
+              <w:spacing w:before="150" w:after="150"/>
+              <w:rPr>
+                <w:rFonts w:ascii="Calibri" w:eastAsia="Times New Roman" w:hAnsi="Calibri" w:cs="Calibri"/>
+                <w:color w:val="1A1A1A"/>
+                <w:sz w:val="20"/>
+                <w:szCs w:val="20"/>
+              </w:rPr>
+            </w:pPr>
+            <w:r>
+              <w:rPr>
+                <w:rFonts w:ascii="Calibri" w:eastAsia="Times New Roman" w:hAnsi="Calibri" w:cs="Calibri"/>
+                <w:color w:val="1A1A1A"/>
+                <w:sz w:val="20"/>
+                <w:szCs w:val="20"/>
+              </w:rPr>
+              <w:t>RF-38</w:t>
+            </w:r>
+          </w:p>
+        </w:tc>
+        <w:tc>
+          <w:tcPr>
+            <w:tcW w:w="0" w:type="auto"/>
+            <w:tcBorders>
+              <w:top w:val="single" w:sz="6" w:space="0" w:color="BBBBBB"/>
+              <w:left w:val="single" w:sz="6" w:space="0" w:color="BBBBBB"/>
+              <w:bottom w:val="single" w:sz="6" w:space="0" w:color="BBBBBB"/>
+              <w:right w:val="single" w:sz="6" w:space="0" w:color="BBBBBB"/>
+            </w:tcBorders>
+            <w:tcMar>
+              <w:top w:w="75" w:type="dxa"/>
+              <w:left w:w="120" w:type="dxa"/>
+              <w:bottom w:w="75" w:type="dxa"/>
+              <w:right w:w="120" w:type="dxa"/>
+            </w:tcMar>
+            <w:hideMark/>
+          </w:tcPr>
+          <w:p>
+            <w:pPr>
+              <w:spacing w:before="150" w:after="150"/>
+              <w:rPr>
+                <w:rFonts w:ascii="Calibri" w:eastAsia="Times New Roman" w:hAnsi="Calibri" w:cs="Calibri"/>
+                <w:b/>
+                <w:bCs/>
+                <w:color w:val="0D6B2E"/>
+                <w:sz w:val="20"/>
+                <w:szCs w:val="20"/>
+              </w:rPr>
+            </w:pPr>
+            <w:r>
+              <w:rPr>
+                <w:rFonts w:ascii="Calibri" w:eastAsia="Times New Roman" w:hAnsi="Calibri" w:cs="Calibri"/>
+                <w:b/>
+                <w:bCs/>
+                <w:color w:val="0D6B2E"/>
+                <w:sz w:val="20"/>
+                <w:szCs w:val="20"/>
+              </w:rPr>
+              <w:t>Implementado</w:t>
+            </w:r>
+          </w:p>
+        </w:tc>
+        <w:tc>
+          <w:tcPr>
+            <w:tcW w:w="0" w:type="auto"/>
+            <w:tcBorders>
+              <w:top w:val="single" w:sz="6" w:space="0" w:color="BBBBBB"/>
+              <w:left w:val="single" w:sz="6" w:space="0" w:color="BBBBBB"/>
+              <w:bottom w:val="single" w:sz="6" w:space="0" w:color="BBBBBB"/>
+              <w:right w:val="single" w:sz="6" w:space="0" w:color="BBBBBB"/>
+            </w:tcBorders>
+            <w:tcMar>
+              <w:top w:w="75" w:type="dxa"/>
+              <w:left w:w="120" w:type="dxa"/>
+              <w:bottom w:w="75" w:type="dxa"/>
+              <w:right w:w="120" w:type="dxa"/>
+            </w:tcMar>
+            <w:hideMark/>
+          </w:tcPr>
+          <w:p>
+            <w:pPr>
+              <w:spacing w:before="150" w:after="150"/>
+              <w:rPr>
+                <w:rFonts w:ascii="Calibri" w:eastAsia="Times New Roman" w:hAnsi="Calibri" w:cs="Calibri"/>
+                <w:color w:val="1A1A1A"/>
+                <w:sz w:val="20"/>
+                <w:szCs w:val="20"/>
+              </w:rPr>
+            </w:pPr>
+            <w:r>
+              <w:rPr>
+                <w:rFonts w:ascii="Calibri" w:eastAsia="Times New Roman" w:hAnsi="Calibri" w:cs="Calibri"/>
+                <w:color w:val="1A1A1A"/>
+                <w:sz w:val="20"/>
+                <w:szCs w:val="20"/>
+              </w:rPr>
+              <w:t>SP lectura seguimiento (historial + batch operador)</w:t>
+            </w:r>
+          </w:p>
+        </w:tc>
+      </w:tr>
+      <w:tr>
+        <w:tc>
+          <w:tcPr>
+            <w:tcW w:w="0" w:type="auto"/>
+            <w:tcBorders>
+              <w:top w:val="single" w:sz="6" w:space="0" w:color="BBBBBB"/>
+              <w:left w:val="single" w:sz="6" w:space="0" w:color="BBBBBB"/>
+              <w:bottom w:val="single" w:sz="6" w:space="0" w:color="BBBBBB"/>
+              <w:right w:val="single" w:sz="6" w:space="0" w:color="BBBBBB"/>
+            </w:tcBorders>
+            <w:tcMar>
+              <w:top w:w="75" w:type="dxa"/>
+              <w:left w:w="120" w:type="dxa"/>
+              <w:bottom w:w="75" w:type="dxa"/>
+              <w:right w:w="120" w:type="dxa"/>
+            </w:tcMar>
+            <w:hideMark/>
+          </w:tcPr>
+          <w:p>
+            <w:pPr>
+              <w:spacing w:before="150" w:after="150"/>
+              <w:rPr>
+                <w:rFonts w:ascii="Calibri" w:eastAsia="Times New Roman" w:hAnsi="Calibri" w:cs="Calibri"/>
+                <w:color w:val="1A1A1A"/>
+                <w:sz w:val="20"/>
+                <w:szCs w:val="20"/>
+              </w:rPr>
+            </w:pPr>
+            <w:r>
+              <w:rPr>
+                <w:rFonts w:ascii="Calibri" w:eastAsia="Times New Roman" w:hAnsi="Calibri" w:cs="Calibri"/>
+                <w:color w:val="1A1A1A"/>
+                <w:sz w:val="20"/>
+                <w:szCs w:val="20"/>
+              </w:rPr>
+              <w:t>RF-39</w:t>
+            </w:r>
+          </w:p>
+        </w:tc>
+        <w:tc>
+          <w:tcPr>
+            <w:tcW w:w="0" w:type="auto"/>
+            <w:tcBorders>
+              <w:top w:val="single" w:sz="6" w:space="0" w:color="BBBBBB"/>
+              <w:left w:val="single" w:sz="6" w:space="0" w:color="BBBBBB"/>
+              <w:bottom w:val="single" w:sz="6" w:space="0" w:color="BBBBBB"/>
+              <w:right w:val="single" w:sz="6" w:space="0" w:color="BBBBBB"/>
+            </w:tcBorders>
+            <w:tcMar>
+              <w:top w:w="75" w:type="dxa"/>
+              <w:left w:w="120" w:type="dxa"/>
+              <w:bottom w:w="75" w:type="dxa"/>
+              <w:right w:w="120" w:type="dxa"/>
+            </w:tcMar>
+            <w:hideMark/>
+          </w:tcPr>
+          <w:p>
+            <w:pPr>
+              <w:spacing w:before="150" w:after="150"/>
+              <w:rPr>
+                <w:rFonts w:ascii="Calibri" w:eastAsia="Times New Roman" w:hAnsi="Calibri" w:cs="Calibri"/>
+                <w:b/>
+                <w:bCs/>
+                <w:color w:val="0D6B2E"/>
+                <w:sz w:val="20"/>
+                <w:szCs w:val="20"/>
+              </w:rPr>
+            </w:pPr>
+            <w:r>
+              <w:rPr>
+                <w:rFonts w:ascii="Calibri" w:eastAsia="Times New Roman" w:hAnsi="Calibri" w:cs="Calibri"/>
+                <w:b/>
+                <w:bCs/>
+                <w:color w:val="0D6B2E"/>
+                <w:sz w:val="20"/>
+                <w:szCs w:val="20"/>
+              </w:rPr>
+              <w:t>Implementado</w:t>
+            </w:r>
+          </w:p>
+        </w:tc>
+        <w:tc>
+          <w:tcPr>
+            <w:tcW w:w="0" w:type="auto"/>
+            <w:tcBorders>
+              <w:top w:val="single" w:sz="6" w:space="0" w:color="BBBBBB"/>
+              <w:left w:val="single" w:sz="6" w:space="0" w:color="BBBBBB"/>
+              <w:bottom w:val="single" w:sz="6" w:space="0" w:color="BBBBBB"/>
+              <w:right w:val="single" w:sz="6" w:space="0" w:color="BBBBBB"/>
+            </w:tcBorders>
+            <w:tcMar>
+              <w:top w:w="75" w:type="dxa"/>
+              <w:left w:w="120" w:type="dxa"/>
+              <w:bottom w:w="75" w:type="dxa"/>
+              <w:right w:w="120" w:type="dxa"/>
+            </w:tcMar>
+            <w:hideMark/>
+          </w:tcPr>
+          <w:p>
+            <w:pPr>
+              <w:spacing w:before="150" w:after="150"/>
+              <w:rPr>
+                <w:rFonts w:ascii="Calibri" w:eastAsia="Times New Roman" w:hAnsi="Calibri" w:cs="Calibri"/>
+                <w:color w:val="1A1A1A"/>
+                <w:sz w:val="20"/>
+                <w:szCs w:val="20"/>
+              </w:rPr>
+            </w:pPr>
+            <w:r>
+              <w:rPr>
+                <w:rFonts w:ascii="Calibri" w:eastAsia="Times New Roman" w:hAnsi="Calibri" w:cs="Calibri"/>
+                <w:color w:val="1A1A1A"/>
+                <w:sz w:val="20"/>
+                <w:szCs w:val="20"/>
+              </w:rPr>
+              <w:t>Badge Referido con metadatos SP</w:t>
+            </w:r>
+          </w:p>
+        </w:tc>
+      </w:tr>
+      <w:tr>
+        <w:tc>
+          <w:tcPr>
+            <w:tcW w:w="0" w:type="auto"/>
+            <w:tcBorders>
+              <w:top w:val="single" w:sz="6" w:space="0" w:color="BBBBBB"/>
+              <w:left w:val="single" w:sz="6" w:space="0" w:color="BBBBBB"/>
+              <w:bottom w:val="single" w:sz="6" w:space="0" w:color="BBBBBB"/>
+              <w:right w:val="single" w:sz="6" w:space="0" w:color="BBBBBB"/>
+            </w:tcBorders>
+            <w:tcMar>
+              <w:top w:w="75" w:type="dxa"/>
+              <w:left w:w="120" w:type="dxa"/>
+              <w:bottom w:w="75" w:type="dxa"/>
+              <w:right w:w="120" w:type="dxa"/>
+            </w:tcMar>
+            <w:hideMark/>
+          </w:tcPr>
+          <w:p>
+            <w:pPr>
+              <w:spacing w:before="150" w:after="150"/>
+              <w:rPr>
+                <w:rFonts w:ascii="Calibri" w:eastAsia="Times New Roman" w:hAnsi="Calibri" w:cs="Calibri"/>
+                <w:color w:val="1A1A1A"/>
+                <w:sz w:val="20"/>
+                <w:szCs w:val="20"/>
+              </w:rPr>
+            </w:pPr>
+            <w:r>
+              <w:rPr>
+                <w:rFonts w:ascii="Calibri" w:eastAsia="Times New Roman" w:hAnsi="Calibri" w:cs="Calibri"/>
+                <w:color w:val="1A1A1A"/>
+                <w:sz w:val="20"/>
+                <w:szCs w:val="20"/>
+              </w:rPr>
+              <w:t>RF-40</w:t>
+            </w:r>
+          </w:p>
+        </w:tc>
+        <w:tc>
+          <w:tcPr>
+            <w:tcW w:w="0" w:type="auto"/>
+            <w:tcBorders>
+              <w:top w:val="single" w:sz="6" w:space="0" w:color="BBBBBB"/>
+              <w:left w:val="single" w:sz="6" w:space="0" w:color="BBBBBB"/>
+              <w:bottom w:val="single" w:sz="6" w:space="0" w:color="BBBBBB"/>
+              <w:right w:val="single" w:sz="6" w:space="0" w:color="BBBBBB"/>
+            </w:tcBorders>
+            <w:tcMar>
+              <w:top w:w="75" w:type="dxa"/>
+              <w:left w:w="120" w:type="dxa"/>
+              <w:bottom w:w="75" w:type="dxa"/>
+              <w:right w:w="120" w:type="dxa"/>
+            </w:tcMar>
+            <w:hideMark/>
+          </w:tcPr>
+          <w:p>
+            <w:pPr>
+              <w:spacing w:before="150" w:after="150"/>
+              <w:rPr>
+                <w:rFonts w:ascii="Calibri" w:eastAsia="Times New Roman" w:hAnsi="Calibri" w:cs="Calibri"/>
+                <w:b/>
+                <w:bCs/>
+                <w:color w:val="0D6B2E"/>
+                <w:sz w:val="20"/>
+                <w:szCs w:val="20"/>
+              </w:rPr>
+            </w:pPr>
+            <w:r>
+              <w:rPr>
+                <w:rFonts w:ascii="Calibri" w:eastAsia="Times New Roman" w:hAnsi="Calibri" w:cs="Calibri"/>
+                <w:b/>
+                <w:bCs/>
+                <w:color w:val="0D6B2E"/>
+                <w:sz w:val="20"/>
+                <w:szCs w:val="20"/>
+              </w:rPr>
+              <w:t>Implementado</w:t>
+            </w:r>
+          </w:p>
+        </w:tc>
+        <w:tc>
+          <w:tcPr>
+            <w:tcW w:w="0" w:type="auto"/>
+            <w:tcBorders>
+              <w:top w:val="single" w:sz="6" w:space="0" w:color="BBBBBB"/>
+              <w:left w:val="single" w:sz="6" w:space="0" w:color="BBBBBB"/>
+              <w:bottom w:val="single" w:sz="6" w:space="0" w:color="BBBBBB"/>
+              <w:right w:val="single" w:sz="6" w:space="0" w:color="BBBBBB"/>
+            </w:tcBorders>
+            <w:tcMar>
+              <w:top w:w="75" w:type="dxa"/>
+              <w:left w:w="120" w:type="dxa"/>
+              <w:bottom w:w="75" w:type="dxa"/>
+              <w:right w:w="120" w:type="dxa"/>
+            </w:tcMar>
+            <w:hideMark/>
+          </w:tcPr>
+          <w:p>
+            <w:pPr>
+              <w:spacing w:before="150" w:after="150"/>
+              <w:rPr>
+                <w:rFonts w:ascii="Calibri" w:eastAsia="Times New Roman" w:hAnsi="Calibri" w:cs="Calibri"/>
+                <w:color w:val="1A1A1A"/>
+                <w:sz w:val="20"/>
+                <w:szCs w:val="20"/>
+              </w:rPr>
+            </w:pPr>
+            <w:r>
+              <w:rPr>
+                <w:rFonts w:ascii="Calibri" w:eastAsia="Times New Roman" w:hAnsi="Calibri" w:cs="Calibri"/>
+                <w:color w:val="1A1A1A"/>
+                <w:sz w:val="20"/>
+                <w:szCs w:val="20"/>
+              </w:rPr>
+              <w:t>Idempotencia referidos (</w:t>
+            </w:r>
+            <w:r>
+              <w:rPr>
+                <w:rStyle w:val="CdigoHTML"/>
+                <w:color w:val="1A1A1A"/>
+              </w:rPr>
+              <w:t>referidosGenerados</w:t>
+            </w:r>
+            <w:r>
+              <w:rPr>
+                <w:rFonts w:ascii="Calibri" w:eastAsia="Times New Roman" w:hAnsi="Calibri" w:cs="Calibri"/>
+                <w:color w:val="1A1A1A"/>
+                <w:sz w:val="20"/>
+                <w:szCs w:val="20"/>
+              </w:rPr>
+              <w:t>)</w:t>
+            </w:r>
+          </w:p>
+        </w:tc>
+      </w:tr>
+      <w:tr>
+        <w:tc>
+          <w:tcPr>
+            <w:tcW w:w="0" w:type="auto"/>
+            <w:tcBorders>
+              <w:top w:val="single" w:sz="6" w:space="0" w:color="BBBBBB"/>
+              <w:left w:val="single" w:sz="6" w:space="0" w:color="BBBBBB"/>
+              <w:bottom w:val="single" w:sz="6" w:space="0" w:color="BBBBBB"/>
+              <w:right w:val="single" w:sz="6" w:space="0" w:color="BBBBBB"/>
+            </w:tcBorders>
+            <w:tcMar>
+              <w:top w:w="75" w:type="dxa"/>
+              <w:left w:w="120" w:type="dxa"/>
+              <w:bottom w:w="75" w:type="dxa"/>
+              <w:right w:w="120" w:type="dxa"/>
+            </w:tcMar>
+            <w:hideMark/>
+          </w:tcPr>
+          <w:p>
+            <w:pPr>
+              <w:spacing w:before="150" w:after="150"/>
+              <w:rPr>
+                <w:rFonts w:ascii="Calibri" w:eastAsia="Times New Roman" w:hAnsi="Calibri" w:cs="Calibri"/>
+                <w:color w:val="1A1A1A"/>
+                <w:sz w:val="20"/>
+                <w:szCs w:val="20"/>
+              </w:rPr>
+            </w:pPr>
+            <w:r>
+              <w:rPr>
+                <w:rFonts w:ascii="Calibri" w:eastAsia="Times New Roman" w:hAnsi="Calibri" w:cs="Calibri"/>
+                <w:color w:val="1A1A1A"/>
+                <w:sz w:val="20"/>
+                <w:szCs w:val="20"/>
+              </w:rPr>
+              <w:t>RF-41</w:t>
+            </w:r>
+          </w:p>
+        </w:tc>
+        <w:tc>
+          <w:tcPr>
+            <w:tcW w:w="0" w:type="auto"/>
+            <w:tcBorders>
+              <w:top w:val="single" w:sz="6" w:space="0" w:color="BBBBBB"/>
+              <w:left w:val="single" w:sz="6" w:space="0" w:color="BBBBBB"/>
+              <w:bottom w:val="single" w:sz="6" w:space="0" w:color="BBBBBB"/>
+              <w:right w:val="single" w:sz="6" w:space="0" w:color="BBBBBB"/>
+            </w:tcBorders>
+            <w:tcMar>
+              <w:top w:w="75" w:type="dxa"/>
+              <w:left w:w="120" w:type="dxa"/>
+              <w:bottom w:w="75" w:type="dxa"/>
+              <w:right w:w="120" w:type="dxa"/>
+            </w:tcMar>
+            <w:hideMark/>
+          </w:tcPr>
+          <w:p>
+            <w:pPr>
+              <w:spacing w:before="150" w:after="150"/>
+              <w:rPr>
+                <w:rFonts w:ascii="Calibri" w:eastAsia="Times New Roman" w:hAnsi="Calibri" w:cs="Calibri"/>
+                <w:b/>
+                <w:bCs/>
+                <w:color w:val="0D6B2E"/>
+                <w:sz w:val="20"/>
+                <w:szCs w:val="20"/>
+              </w:rPr>
+            </w:pPr>
+            <w:r>
+              <w:rPr>
+                <w:rFonts w:ascii="Calibri" w:eastAsia="Times New Roman" w:hAnsi="Calibri" w:cs="Calibri"/>
+                <w:b/>
+                <w:bCs/>
+                <w:color w:val="0D6B2E"/>
+                <w:sz w:val="20"/>
+                <w:szCs w:val="20"/>
+              </w:rPr>
+              <w:t>Implementado</w:t>
+            </w:r>
+          </w:p>
+        </w:tc>
+        <w:tc>
+          <w:tcPr>
+            <w:tcW w:w="0" w:type="auto"/>
+            <w:tcBorders>
+              <w:top w:val="single" w:sz="6" w:space="0" w:color="BBBBBB"/>
+              <w:left w:val="single" w:sz="6" w:space="0" w:color="BBBBBB"/>
+              <w:bottom w:val="single" w:sz="6" w:space="0" w:color="BBBBBB"/>
+              <w:right w:val="single" w:sz="6" w:space="0" w:color="BBBBBB"/>
+            </w:tcBorders>
+            <w:tcMar>
+              <w:top w:w="75" w:type="dxa"/>
+              <w:left w:w="120" w:type="dxa"/>
+              <w:bottom w:w="75" w:type="dxa"/>
+              <w:right w:w="120" w:type="dxa"/>
+            </w:tcMar>
+            <w:hideMark/>
+          </w:tcPr>
+          <w:p>
+            <w:pPr>
+              <w:spacing w:before="150" w:after="150"/>
+              <w:rPr>
+                <w:rFonts w:ascii="Calibri" w:eastAsia="Times New Roman" w:hAnsi="Calibri" w:cs="Calibri"/>
+                <w:color w:val="1A1A1A"/>
+                <w:sz w:val="20"/>
+                <w:szCs w:val="20"/>
+              </w:rPr>
+            </w:pPr>
+            <w:r>
+              <w:rPr>
+                <w:rFonts w:ascii="Calibri" w:eastAsia="Times New Roman" w:hAnsi="Calibri" w:cs="Calibri"/>
+                <w:color w:val="1A1A1A"/>
+                <w:sz w:val="20"/>
+                <w:szCs w:val="20"/>
+              </w:rPr>
+              <w:t xml:space="preserve">Links redes desde </w:t>
+            </w:r>
+            <w:r>
+              <w:rPr>
+                <w:rStyle w:val="CdigoHTML"/>
+                <w:color w:val="1A1A1A"/>
+              </w:rPr>
+              <w:t>rptLinkQRenRedesSociales</w:t>
+            </w:r>
+          </w:p>
+        </w:tc>
+      </w:tr>
+      <w:tr>
+        <w:tc>
+          <w:tcPr>
+            <w:tcW w:w="0" w:type="auto"/>
+            <w:tcBorders>
+              <w:top w:val="single" w:sz="6" w:space="0" w:color="BBBBBB"/>
+              <w:left w:val="single" w:sz="6" w:space="0" w:color="BBBBBB"/>
+              <w:bottom w:val="single" w:sz="6" w:space="0" w:color="BBBBBB"/>
+              <w:right w:val="single" w:sz="6" w:space="0" w:color="BBBBBB"/>
+            </w:tcBorders>
+            <w:tcMar>
+              <w:top w:w="75" w:type="dxa"/>
+              <w:left w:w="120" w:type="dxa"/>
+              <w:bottom w:w="75" w:type="dxa"/>
+              <w:right w:w="120" w:type="dxa"/>
+            </w:tcMar>
+            <w:hideMark/>
+          </w:tcPr>
+          <w:p>
+            <w:pPr>
+              <w:spacing w:before="150" w:after="150"/>
+              <w:rPr>
+                <w:rFonts w:ascii="Calibri" w:eastAsia="Times New Roman" w:hAnsi="Calibri" w:cs="Calibri"/>
+                <w:color w:val="1A1A1A"/>
+                <w:sz w:val="20"/>
+                <w:szCs w:val="20"/>
+              </w:rPr>
+            </w:pPr>
+            <w:r>
+              <w:rPr>
+                <w:rFonts w:ascii="Calibri" w:eastAsia="Times New Roman" w:hAnsi="Calibri" w:cs="Calibri"/>
+                <w:color w:val="1A1A1A"/>
+                <w:sz w:val="20"/>
+                <w:szCs w:val="20"/>
+              </w:rPr>
+              <w:t>RF-42</w:t>
+            </w:r>
+          </w:p>
+        </w:tc>
+        <w:tc>
+          <w:tcPr>
+            <w:tcW w:w="0" w:type="auto"/>
+            <w:tcBorders>
+              <w:top w:val="single" w:sz="6" w:space="0" w:color="BBBBBB"/>
+              <w:left w:val="single" w:sz="6" w:space="0" w:color="BBBBBB"/>
+              <w:bottom w:val="single" w:sz="6" w:space="0" w:color="BBBBBB"/>
+              <w:right w:val="single" w:sz="6" w:space="0" w:color="BBBBBB"/>
+            </w:tcBorders>
+            <w:tcMar>
+              <w:top w:w="75" w:type="dxa"/>
+              <w:left w:w="120" w:type="dxa"/>
+              <w:bottom w:w="75" w:type="dxa"/>
+              <w:right w:w="120" w:type="dxa"/>
+            </w:tcMar>
+            <w:hideMark/>
+          </w:tcPr>
+          <w:p>
+            <w:pPr>
+              <w:spacing w:before="150" w:after="150"/>
+              <w:rPr>
+                <w:rFonts w:ascii="Calibri" w:eastAsia="Times New Roman" w:hAnsi="Calibri" w:cs="Calibri"/>
+                <w:b/>
+                <w:bCs/>
+                <w:color w:val="0D6B2E"/>
+                <w:sz w:val="20"/>
+                <w:szCs w:val="20"/>
+              </w:rPr>
+            </w:pPr>
+            <w:r>
+              <w:rPr>
+                <w:rFonts w:ascii="Calibri" w:eastAsia="Times New Roman" w:hAnsi="Calibri" w:cs="Calibri"/>
+                <w:b/>
+                <w:bCs/>
+                <w:color w:val="0D6B2E"/>
+                <w:sz w:val="20"/>
+                <w:szCs w:val="20"/>
+              </w:rPr>
+              <w:t>Implementado</w:t>
+            </w:r>
+          </w:p>
+        </w:tc>
+        <w:tc>
+          <w:tcPr>
+            <w:tcW w:w="0" w:type="auto"/>
+            <w:tcBorders>
+              <w:top w:val="single" w:sz="6" w:space="0" w:color="BBBBBB"/>
+              <w:left w:val="single" w:sz="6" w:space="0" w:color="BBBBBB"/>
+              <w:bottom w:val="single" w:sz="6" w:space="0" w:color="BBBBBB"/>
+              <w:right w:val="single" w:sz="6" w:space="0" w:color="BBBBBB"/>
+            </w:tcBorders>
+            <w:tcMar>
+              <w:top w:w="75" w:type="dxa"/>
+              <w:left w:w="120" w:type="dxa"/>
+              <w:bottom w:w="75" w:type="dxa"/>
+              <w:right w:w="120" w:type="dxa"/>
+            </w:tcMar>
+            <w:hideMark/>
+          </w:tcPr>
+          <w:p>
+            <w:pPr>
+              <w:spacing w:before="150" w:after="150"/>
+              <w:rPr>
+                <w:rFonts w:ascii="Calibri" w:eastAsia="Times New Roman" w:hAnsi="Calibri" w:cs="Calibri"/>
+                <w:color w:val="1A1A1A"/>
+                <w:sz w:val="20"/>
+                <w:szCs w:val="20"/>
+              </w:rPr>
+            </w:pPr>
+            <w:r>
+              <w:rPr>
+                <w:rFonts w:ascii="Calibri" w:eastAsia="Times New Roman" w:hAnsi="Calibri" w:cs="Calibri"/>
+                <w:color w:val="1A1A1A"/>
+                <w:sz w:val="20"/>
+                <w:szCs w:val="20"/>
+              </w:rPr>
+              <w:t>Export CSV prueba links (</w:t>
+            </w:r>
+            <w:r>
+              <w:rPr>
+                <w:rStyle w:val="CdigoHTML"/>
+                <w:color w:val="1A1A1A"/>
+              </w:rPr>
+              <w:t>links:export-prueba</w:t>
+            </w:r>
+            <w:r>
+              <w:rPr>
+                <w:rFonts w:ascii="Calibri" w:eastAsia="Times New Roman" w:hAnsi="Calibri" w:cs="Calibri"/>
+                <w:color w:val="1A1A1A"/>
+                <w:sz w:val="20"/>
+                <w:szCs w:val="20"/>
+              </w:rPr>
+              <w:t>)</w:t>
+            </w:r>
+          </w:p>
+        </w:tc>
+      </w:tr>
+      <w:tr>
+        <w:tc>
+          <w:tcPr>
+            <w:tcW w:w="0" w:type="auto"/>
+            <w:tcBorders>
+              <w:top w:val="single" w:sz="6" w:space="0" w:color="BBBBBB"/>
+              <w:left w:val="single" w:sz="6" w:space="0" w:color="BBBBBB"/>
+              <w:bottom w:val="single" w:sz="6" w:space="0" w:color="BBBBBB"/>
+              <w:right w:val="single" w:sz="6" w:space="0" w:color="BBBBBB"/>
+            </w:tcBorders>
+            <w:tcMar>
+              <w:top w:w="75" w:type="dxa"/>
+              <w:left w:w="120" w:type="dxa"/>
+              <w:bottom w:w="75" w:type="dxa"/>
+              <w:right w:w="120" w:type="dxa"/>
+            </w:tcMar>
+            <w:hideMark/>
+          </w:tcPr>
+          <w:p>
+            <w:pPr>
+              <w:spacing w:before="150" w:after="150"/>
+              <w:rPr>
+                <w:rFonts w:ascii="Calibri" w:eastAsia="Times New Roman" w:hAnsi="Calibri" w:cs="Calibri"/>
+                <w:color w:val="1A1A1A"/>
+                <w:sz w:val="20"/>
+                <w:szCs w:val="20"/>
+              </w:rPr>
+            </w:pPr>
+            <w:r>
+              <w:rPr>
+                <w:rFonts w:ascii="Calibri" w:eastAsia="Times New Roman" w:hAnsi="Calibri" w:cs="Calibri"/>
+                <w:color w:val="1A1A1A"/>
+                <w:sz w:val="20"/>
+                <w:szCs w:val="20"/>
+              </w:rPr>
+              <w:t>RF-43</w:t>
+            </w:r>
+          </w:p>
+        </w:tc>
+        <w:tc>
+          <w:tcPr>
+            <w:tcW w:w="0" w:type="auto"/>
+            <w:tcBorders>
+              <w:top w:val="single" w:sz="6" w:space="0" w:color="BBBBBB"/>
+              <w:left w:val="single" w:sz="6" w:space="0" w:color="BBBBBB"/>
+              <w:bottom w:val="single" w:sz="6" w:space="0" w:color="BBBBBB"/>
+              <w:right w:val="single" w:sz="6" w:space="0" w:color="BBBBBB"/>
+            </w:tcBorders>
+            <w:tcMar>
+              <w:top w:w="75" w:type="dxa"/>
+              <w:left w:w="120" w:type="dxa"/>
+              <w:bottom w:w="75" w:type="dxa"/>
+              <w:right w:w="120" w:type="dxa"/>
+            </w:tcMar>
+            <w:hideMark/>
+          </w:tcPr>
+          <w:p>
+            <w:pPr>
+              <w:spacing w:before="150" w:after="150"/>
+              <w:rPr>
+                <w:rFonts w:ascii="Calibri" w:eastAsia="Times New Roman" w:hAnsi="Calibri" w:cs="Calibri"/>
+                <w:b/>
+                <w:bCs/>
+                <w:color w:val="0D6B2E"/>
+                <w:sz w:val="20"/>
+                <w:szCs w:val="20"/>
+              </w:rPr>
+            </w:pPr>
+            <w:r>
+              <w:rPr>
+                <w:rFonts w:ascii="Calibri" w:eastAsia="Times New Roman" w:hAnsi="Calibri" w:cs="Calibri"/>
+                <w:b/>
+                <w:bCs/>
+                <w:color w:val="0D6B2E"/>
+                <w:sz w:val="20"/>
+                <w:szCs w:val="20"/>
+              </w:rPr>
+              <w:t>Implementado</w:t>
+            </w:r>
+          </w:p>
+        </w:tc>
+        <w:tc>
+          <w:tcPr>
+            <w:tcW w:w="0" w:type="auto"/>
+            <w:tcBorders>
+              <w:top w:val="single" w:sz="6" w:space="0" w:color="BBBBBB"/>
+              <w:left w:val="single" w:sz="6" w:space="0" w:color="BBBBBB"/>
+              <w:bottom w:val="single" w:sz="6" w:space="0" w:color="BBBBBB"/>
+              <w:right w:val="single" w:sz="6" w:space="0" w:color="BBBBBB"/>
+            </w:tcBorders>
+            <w:tcMar>
+              <w:top w:w="75" w:type="dxa"/>
+              <w:left w:w="120" w:type="dxa"/>
+              <w:bottom w:w="75" w:type="dxa"/>
+              <w:right w:w="120" w:type="dxa"/>
+            </w:tcMar>
+            <w:hideMark/>
+          </w:tcPr>
+          <w:p>
+            <w:pPr>
+              <w:spacing w:before="150" w:after="150"/>
+              <w:rPr>
+                <w:rFonts w:ascii="Calibri" w:eastAsia="Times New Roman" w:hAnsi="Calibri" w:cs="Calibri"/>
+                <w:color w:val="1A1A1A"/>
+                <w:sz w:val="20"/>
+                <w:szCs w:val="20"/>
+              </w:rPr>
+            </w:pPr>
+            <w:r>
+              <w:rPr>
+                <w:rFonts w:ascii="Calibri" w:eastAsia="Times New Roman" w:hAnsi="Calibri" w:cs="Calibri"/>
+                <w:color w:val="1A1A1A"/>
+                <w:sz w:val="20"/>
+                <w:szCs w:val="20"/>
+              </w:rPr>
+              <w:t>Origen carga QR (1) vs manual (2)</w:t>
+            </w:r>
+          </w:p>
+        </w:tc>
+      </w:tr>
+    </w:tbl>
+    <w:p>
+      <w:pPr>
+        <w:pStyle w:val="Ttulo3"/>
+        <w:rPr>
+          <w:rFonts w:ascii="Calibri" w:eastAsia="Times New Roman" w:hAnsi="Calibri" w:cs="Calibri"/>
+          <w:lang w:val="es-ES"/>
+        </w:rPr>
+      </w:pPr>
+      <w:r>
+        <w:rPr>
+          <w:rFonts w:ascii="Calibri" w:eastAsia="Times New Roman" w:hAnsi="Calibri" w:cs="Calibri"/>
+          <w:lang w:val="es-ES"/>
+        </w:rPr>
+        <w:t>15.2–15.6 Resumen</w:t>
+      </w:r>
+    </w:p>
+    <w:p>
+      <w:pPr>
+        <w:numPr>
+          <w:ilvl w:val="0"/>
+          <w:numId w:val="18"/>
+        </w:numPr>
+        <w:spacing w:before="100" w:beforeAutospacing="1" w:after="100" w:afterAutospacing="1"/>
+        <w:rPr>
+          <w:rFonts w:ascii="Calibri" w:eastAsia="Times New Roman" w:hAnsi="Calibri" w:cs="Calibri"/>
+          <w:color w:val="1A1A1A"/>
+          <w:sz w:val="22"/>
+          <w:szCs w:val="22"/>
+          <w:lang w:val="es-ES"/>
+        </w:rPr>
+      </w:pPr>
+      <w:r>
+        <w:rPr>
+          <w:rStyle w:val="Fuerte"/>
+          <w:rFonts w:ascii="Calibri" w:eastAsia="Times New Roman" w:hAnsi="Calibri" w:cs="Calibri"/>
+          <w:color w:val="1A1A1A"/>
+          <w:sz w:val="22"/>
+          <w:szCs w:val="22"/>
+          <w:lang w:val="es-ES"/>
+        </w:rPr>
+        <w:t>Historial inline:</w:t>
+      </w:r>
+      <w:r>
+        <w:rPr>
+          <w:rFonts w:ascii="Calibri" w:eastAsia="Times New Roman" w:hAnsi="Calibri" w:cs="Calibri"/>
+          <w:color w:val="1A1A1A"/>
+          <w:sz w:val="22"/>
+          <w:szCs w:val="22"/>
+          <w:lang w:val="es-ES"/>
+        </w:rPr>
+        <w:t xml:space="preserve"> </w:t>
+      </w:r>
+      <w:r>
+        <w:rPr>
+          <w:rStyle w:val="CdigoHTML"/>
+          <w:color w:val="1A1A1A"/>
+          <w:lang w:val="es-ES"/>
+        </w:rPr>
+        <w:t>useHistorialLeads</w:t>
+      </w:r>
+      <w:r>
+        <w:rPr>
+          <w:rFonts w:ascii="Calibri" w:eastAsia="Times New Roman" w:hAnsi="Calibri" w:cs="Calibri"/>
+          <w:color w:val="1A1A1A"/>
+          <w:sz w:val="22"/>
+          <w:szCs w:val="22"/>
+          <w:lang w:val="es-ES"/>
+        </w:rPr>
+        <w:t xml:space="preserve">, </w:t>
+      </w:r>
+      <w:r>
+        <w:rPr>
+          <w:rStyle w:val="CdigoHTML"/>
+          <w:color w:val="1A1A1A"/>
+          <w:lang w:val="es-ES"/>
+        </w:rPr>
+        <w:t>LeadHistorialInline</w:t>
+      </w:r>
+      <w:r>
+        <w:rPr>
+          <w:rFonts w:ascii="Calibri" w:eastAsia="Times New Roman" w:hAnsi="Calibri" w:cs="Calibri"/>
+          <w:color w:val="1A1A1A"/>
+          <w:sz w:val="22"/>
+          <w:szCs w:val="22"/>
+          <w:lang w:val="es-ES"/>
+        </w:rPr>
+        <w:t xml:space="preserve"> en </w:t>
+      </w:r>
+      <w:r>
+        <w:rPr>
+          <w:rStyle w:val="CdigoHTML"/>
+          <w:color w:val="1A1A1A"/>
+          <w:lang w:val="es-ES"/>
+        </w:rPr>
+        <w:t>LeadCard</w:t>
+      </w:r>
+      <w:r>
+        <w:rPr>
+          <w:rFonts w:ascii="Calibri" w:eastAsia="Times New Roman" w:hAnsi="Calibri" w:cs="Calibri"/>
+          <w:color w:val="1A1A1A"/>
+          <w:sz w:val="22"/>
+          <w:szCs w:val="22"/>
+          <w:lang w:val="es-ES"/>
+        </w:rPr>
+        <w:t>.</w:t>
+      </w:r>
+    </w:p>
+    <w:p>
+      <w:pPr>
+        <w:numPr>
+          <w:ilvl w:val="0"/>
+          <w:numId w:val="18"/>
+        </w:numPr>
+        <w:spacing w:before="100" w:beforeAutospacing="1" w:after="100" w:afterAutospacing="1"/>
+        <w:rPr>
+          <w:rFonts w:ascii="Calibri" w:eastAsia="Times New Roman" w:hAnsi="Calibri" w:cs="Calibri"/>
+          <w:color w:val="1A1A1A"/>
+          <w:sz w:val="22"/>
+          <w:szCs w:val="22"/>
+          <w:lang w:val="es-ES"/>
+        </w:rPr>
+      </w:pPr>
+      <w:r>
+        <w:rPr>
+          <w:rStyle w:val="Fuerte"/>
+          <w:rFonts w:ascii="Calibri" w:eastAsia="Times New Roman" w:hAnsi="Calibri" w:cs="Calibri"/>
+          <w:color w:val="1A1A1A"/>
+          <w:sz w:val="22"/>
+          <w:szCs w:val="22"/>
+          <w:lang w:val="es-ES"/>
+        </w:rPr>
+        <w:t>SP lectura:</w:t>
+      </w:r>
+      <w:r>
+        <w:rPr>
+          <w:rFonts w:ascii="Calibri" w:eastAsia="Times New Roman" w:hAnsi="Calibri" w:cs="Calibri"/>
+          <w:color w:val="1A1A1A"/>
+          <w:sz w:val="22"/>
+          <w:szCs w:val="22"/>
+          <w:lang w:val="es-ES"/>
+        </w:rPr>
+        <w:t xml:space="preserve"> </w:t>
+      </w:r>
+      <w:r>
+        <w:rPr>
+          <w:rStyle w:val="CdigoHTML"/>
+          <w:color w:val="1A1A1A"/>
+          <w:lang w:val="es-ES"/>
+        </w:rPr>
+        <w:t>SP_HistorialSeguimientoLead</w:t>
+      </w:r>
+      <w:r>
+        <w:rPr>
+          <w:rFonts w:ascii="Calibri" w:eastAsia="Times New Roman" w:hAnsi="Calibri" w:cs="Calibri"/>
+          <w:color w:val="1A1A1A"/>
+          <w:sz w:val="22"/>
+          <w:szCs w:val="22"/>
+          <w:lang w:val="es-ES"/>
+        </w:rPr>
+        <w:t xml:space="preserve">, </w:t>
+      </w:r>
+      <w:r>
+        <w:rPr>
+          <w:rStyle w:val="CdigoHTML"/>
+          <w:color w:val="1A1A1A"/>
+          <w:lang w:val="es-ES"/>
+        </w:rPr>
+        <w:t>SP_UltimoSeguimientoOperador</w:t>
+      </w:r>
+      <w:r>
+        <w:rPr>
+          <w:rFonts w:ascii="Calibri" w:eastAsia="Times New Roman" w:hAnsi="Calibri" w:cs="Calibri"/>
+          <w:color w:val="1A1A1A"/>
+          <w:sz w:val="22"/>
+          <w:szCs w:val="22"/>
+          <w:lang w:val="es-ES"/>
+        </w:rPr>
+        <w:t xml:space="preserve"> — ver </w:t>
+      </w:r>
+      <w:r>
+        <w:rPr>
+          <w:rStyle w:val="CdigoHTML"/>
+          <w:color w:val="1A1A1A"/>
+          <w:lang w:val="es-ES"/>
+        </w:rPr>
+        <w:t>SP_ConsultarSeguimientoLead-notas.sql</w:t>
+      </w:r>
+      <w:r>
+        <w:rPr>
+          <w:rFonts w:ascii="Calibri" w:eastAsia="Times New Roman" w:hAnsi="Calibri" w:cs="Calibri"/>
+          <w:color w:val="1A1A1A"/>
+          <w:sz w:val="22"/>
+          <w:szCs w:val="22"/>
+          <w:lang w:val="es-ES"/>
+        </w:rPr>
+        <w:t>.</w:t>
+      </w:r>
+    </w:p>
+    <w:p>
+      <w:pPr>
+        <w:numPr>
+          <w:ilvl w:val="0"/>
+          <w:numId w:val="18"/>
+        </w:numPr>
+        <w:spacing w:before="100" w:beforeAutospacing="1" w:after="100" w:afterAutospacing="1"/>
+        <w:rPr>
+          <w:rFonts w:ascii="Calibri" w:eastAsia="Times New Roman" w:hAnsi="Calibri" w:cs="Calibri"/>
+          <w:color w:val="1A1A1A"/>
+          <w:sz w:val="22"/>
+          <w:szCs w:val="22"/>
+          <w:lang w:val="es-ES"/>
+        </w:rPr>
+      </w:pPr>
+      <w:r>
+        <w:rPr>
+          <w:rStyle w:val="Fuerte"/>
+          <w:rFonts w:ascii="Calibri" w:eastAsia="Times New Roman" w:hAnsi="Calibri" w:cs="Calibri"/>
+          <w:color w:val="1A1A1A"/>
+          <w:sz w:val="22"/>
+          <w:szCs w:val="22"/>
+          <w:lang w:val="es-ES"/>
+        </w:rPr>
+        <w:t>Referidos:</w:t>
+      </w:r>
+      <w:r>
+        <w:rPr>
+          <w:rFonts w:ascii="Calibri" w:eastAsia="Times New Roman" w:hAnsi="Calibri" w:cs="Calibri"/>
+          <w:color w:val="1A1A1A"/>
+          <w:sz w:val="22"/>
+          <w:szCs w:val="22"/>
+          <w:lang w:val="es-ES"/>
+        </w:rPr>
+        <w:t xml:space="preserve"> badge, </w:t>
+      </w:r>
+      <w:r>
+        <w:rPr>
+          <w:rStyle w:val="CdigoHTML"/>
+          <w:color w:val="1A1A1A"/>
+          <w:lang w:val="es-ES"/>
+        </w:rPr>
+        <w:t>SP_ObtenerMetaReferidosLead</w:t>
+      </w:r>
+      <w:r>
+        <w:rPr>
+          <w:rFonts w:ascii="Calibri" w:eastAsia="Times New Roman" w:hAnsi="Calibri" w:cs="Calibri"/>
+          <w:color w:val="1A1A1A"/>
+          <w:sz w:val="22"/>
+          <w:szCs w:val="22"/>
+          <w:lang w:val="es-ES"/>
+        </w:rPr>
+        <w:t xml:space="preserve">, fix </w:t>
+      </w:r>
+      <w:r>
+        <w:rPr>
+          <w:rStyle w:val="CdigoHTML"/>
+          <w:color w:val="1A1A1A"/>
+          <w:lang w:val="es-ES"/>
+        </w:rPr>
+        <w:t>lead_referido-fix-campo3-campo4-pablo.sql</w:t>
+      </w:r>
+      <w:r>
+        <w:rPr>
+          <w:rFonts w:ascii="Calibri" w:eastAsia="Times New Roman" w:hAnsi="Calibri" w:cs="Calibri"/>
+          <w:color w:val="1A1A1A"/>
+          <w:sz w:val="22"/>
+          <w:szCs w:val="22"/>
+          <w:lang w:val="es-ES"/>
+        </w:rPr>
+        <w:t>.</w:t>
+      </w:r>
+    </w:p>
+    <w:p>
+      <w:pPr>
+        <w:numPr>
+          <w:ilvl w:val="0"/>
+          <w:numId w:val="18"/>
+        </w:numPr>
+        <w:spacing w:before="100" w:beforeAutospacing="1" w:after="100" w:afterAutospacing="1"/>
+        <w:rPr>
+          <w:rFonts w:ascii="Calibri" w:eastAsia="Times New Roman" w:hAnsi="Calibri" w:cs="Calibri"/>
+          <w:color w:val="1A1A1A"/>
+          <w:sz w:val="22"/>
+          <w:szCs w:val="22"/>
+          <w:lang w:val="es-ES"/>
+        </w:rPr>
+      </w:pPr>
+      <w:r>
+        <w:rPr>
+          <w:rStyle w:val="Fuerte"/>
+          <w:rFonts w:ascii="Calibri" w:eastAsia="Times New Roman" w:hAnsi="Calibri" w:cs="Calibri"/>
+          <w:color w:val="1A1A1A"/>
+          <w:sz w:val="22"/>
+          <w:szCs w:val="22"/>
+          <w:lang w:val="es-ES"/>
+        </w:rPr>
+        <w:t>Links:</w:t>
+      </w:r>
+      <w:r>
+        <w:rPr>
+          <w:rFonts w:ascii="Calibri" w:eastAsia="Times New Roman" w:hAnsi="Calibri" w:cs="Calibri"/>
+          <w:color w:val="1A1A1A"/>
+          <w:sz w:val="22"/>
+          <w:szCs w:val="22"/>
+          <w:lang w:val="es-ES"/>
+        </w:rPr>
+        <w:t xml:space="preserve"> SP default STRSYSTEM, export CSV, </w:t>
+      </w:r>
+      <w:r>
+        <w:rPr>
+          <w:rStyle w:val="CdigoHTML"/>
+          <w:color w:val="1A1A1A"/>
+          <w:lang w:val="es-ES"/>
+        </w:rPr>
+        <w:t>inspect:links-redes</w:t>
+      </w:r>
+      <w:r>
+        <w:rPr>
+          <w:rFonts w:ascii="Calibri" w:eastAsia="Times New Roman" w:hAnsi="Calibri" w:cs="Calibri"/>
+          <w:color w:val="1A1A1A"/>
+          <w:sz w:val="22"/>
+          <w:szCs w:val="22"/>
+          <w:lang w:val="es-ES"/>
+        </w:rPr>
+        <w:t>.</w:t>
+      </w:r>
+    </w:p>
+    <w:p>
+      <w:pPr>
+        <w:numPr>
+          <w:ilvl w:val="0"/>
+          <w:numId w:val="18"/>
+        </w:numPr>
+        <w:spacing w:before="100" w:beforeAutospacing="1" w:after="100" w:afterAutospacing="1"/>
+        <w:rPr>
+          <w:rFonts w:ascii="Calibri" w:eastAsia="Times New Roman" w:hAnsi="Calibri" w:cs="Calibri"/>
+          <w:color w:val="1A1A1A"/>
+          <w:sz w:val="22"/>
+          <w:szCs w:val="22"/>
+          <w:lang w:val="es-ES"/>
+        </w:rPr>
+      </w:pPr>
+      <w:r>
+        <w:rPr>
+          <w:rStyle w:val="Fuerte"/>
+          <w:rFonts w:ascii="Calibri" w:eastAsia="Times New Roman" w:hAnsi="Calibri" w:cs="Calibri"/>
+          <w:color w:val="1A1A1A"/>
+          <w:sz w:val="22"/>
+          <w:szCs w:val="22"/>
+          <w:lang w:val="es-ES"/>
+        </w:rPr>
+        <w:t>DBA nuevos ítems 17–20</w:t>
+      </w:r>
+      <w:r>
+        <w:rPr>
+          <w:rFonts w:ascii="Calibri" w:eastAsia="Times New Roman" w:hAnsi="Calibri" w:cs="Calibri"/>
+          <w:color w:val="1A1A1A"/>
+          <w:sz w:val="22"/>
+          <w:szCs w:val="22"/>
+          <w:lang w:val="es-ES"/>
+        </w:rPr>
+        <w:t xml:space="preserve"> en §15.4 del .md.</w:t>
+      </w:r>
+    </w:p>
+    <w:p>
+      <w:pPr>
+        <w:pStyle w:val="Ttulo3"/>
+        <w:rPr>
+          <w:rFonts w:ascii="Calibri" w:eastAsia="Times New Roman" w:hAnsi="Calibri" w:cs="Calibri"/>
+          <w:lang w:val="es-ES"/>
+        </w:rPr>
+      </w:pPr>
+      <w:r>
+        <w:rPr>
+          <w:rFonts w:ascii="Calibri" w:eastAsia="Times New Roman" w:hAnsi="Calibri" w:cs="Calibri"/>
+          <w:lang w:val="es-ES"/>
+        </w:rPr>
+        <w:t>15.7 URL producción</w:t>
+      </w:r>
+    </w:p>
+    <w:p>
+      <w:pPr>
+        <w:pStyle w:val="NormalWeb"/>
+        <w:rPr>
+          <w:rFonts w:ascii="Calibri" w:hAnsi="Calibri" w:cs="Calibri"/>
+          <w:color w:val="1A1A1A"/>
+          <w:sz w:val="22"/>
+          <w:szCs w:val="22"/>
+          <w:lang w:val="es-ES"/>
+        </w:rPr>
+      </w:pPr>
+      <w:hyperlink r:id="rId5" w:history="1">
+        <w:r>
+          <w:rPr>
+            <w:rStyle w:val="Hipervnculo"/>
+            <w:rFonts w:ascii="Calibri" w:hAnsi="Calibri" w:cs="Calibri"/>
+            <w:sz w:val="22"/>
+            <w:szCs w:val="22"/>
+            <w:lang w:val="es-ES"/>
+          </w:rPr>
+          <w:t>https://www.miprimercasafsa-sorteo.com/leads/</w:t>
+        </w:r>
+      </w:hyperlink>
+    </w:p>
+    <w:p>
+      <w:pPr>
+        <w:pStyle w:val="subtitle"/>
+        <w:rPr>
+          <w:rFonts w:ascii="Calibri" w:hAnsi="Calibri" w:cs="Calibri"/>
+          <w:sz w:val="22"/>
+          <w:szCs w:val="22"/>
+          <w:lang w:val="es-ES"/>
+        </w:rPr>
+      </w:pPr>
+      <w:r>
+        <w:rPr>
+          <w:rFonts w:ascii="Calibri" w:hAnsi="Calibri" w:cs="Calibri"/>
+          <w:sz w:val="22"/>
+          <w:szCs w:val="22"/>
+          <w:lang w:val="es-ES"/>
+        </w:rPr>
+        <w:t xml:space="preserve">Las novedades se agregan en </w:t>
+      </w:r>
+      <w:r>
+        <w:rPr>
+          <w:rStyle w:val="Fuerte"/>
+          <w:rFonts w:ascii="Calibri" w:hAnsi="Calibri" w:cs="Calibri"/>
+          <w:sz w:val="22"/>
+          <w:szCs w:val="22"/>
+          <w:lang w:val="es-ES"/>
+        </w:rPr>
         <w:t>§14</w:t>
+      </w:r>
+      <w:r>
+        <w:rPr>
+          <w:rFonts w:ascii="Calibri" w:hAnsi="Calibri" w:cs="Calibri"/>
+          <w:sz w:val="22"/>
+          <w:szCs w:val="22"/>
+          <w:lang w:val="es-ES"/>
+        </w:rPr>
+        <w:t xml:space="preserve"> y </w:t>
+      </w:r>
+      <w:r>
+        <w:rPr>
+          <w:rStyle w:val="Fuerte"/>
+          <w:rFonts w:ascii="Calibri" w:hAnsi="Calibri" w:cs="Calibri"/>
+          <w:sz w:val="22"/>
+          <w:szCs w:val="22"/>
+          <w:lang w:val="es-ES"/>
+        </w:rPr>
+        <w:t>§15</w:t>
       </w:r>
       <w:r>
         <w:rPr>
@@ -36010,122 +38361,9 @@
 <file path=word/numbering.xml><?xml version="1.0" encoding="utf-8"?>
 <w:numbering xmlns:wpc="http://schemas.microsoft.com/office/word/2010/wordprocessingCanvas" xmlns:cx="http://schemas.microsoft.com/office/drawing/2014/chartex" xmlns:cx1="http://schemas.microsoft.com/office/drawing/2015/9/8/chartex" xmlns:cx2="http://schemas.microsoft.com/office/drawing/2015/10/21/chartex" xmlns:cx3="http://schemas.microsoft.com/office/drawing/2016/5/9/chartex" xmlns:cx4="http://schemas.microsoft.com/office/drawing/2016/5/10/chartex" xmlns:cx5="http://schemas.microsoft.com/office/drawing/2016/5/11/chartex" xmlns:cx6="http://schemas.microsoft.com/office/drawing/2016/5/12/chartex" xmlns:cx7="http://schemas.microsoft.com/office/drawing/2016/5/13/chartex" xmlns:cx8="http://schemas.microsoft.com/office/drawing/2016/5/14/chartex" xmlns:mc="http://schemas.openxmlformats.org/markup-compatibility/2006" xmlns:aink="http://schemas.microsoft.com/office/drawing/2016/ink" xmlns:am3d="http://schemas.microsoft.com/office/drawing/2017/model3d" xmlns:o="urn:schemas-microsoft-com:office:office" xmlns:oel="http://schemas.microsoft.com/office/2019/extlst" xmlns:r="http://schemas.openxmlformats.org/officeDocument/2006/relationships" xmlns:m="http://schemas.openxmlformats.org/officeDocument/2006/math" xmlns:v="urn:schemas-microsoft-com:vml" xmlns:wp14="http://schemas.microsoft.com/office/word/2010/wordprocessingDrawing" xmlns:wp="http://schemas.openxmlformats.org/drawingml/2006/wordprocessingDrawing" xmlns:w10="urn:schemas-microsoft-com:office:word" xmlns:w="http://schemas.openxmlformats.org/wordprocessingml/2006/main" xmlns:w14="http://schemas.microsoft.com/office/word/2010/wordml" xmlns:w15="http://schemas.microsoft.com/office/word/2012/wordml" xmlns:w16cex="http://schemas.microsoft.com/office/word/2018/wordml/cex" xmlns:w16cid="http://schemas.microsoft.com/office/word/2016/wordml/cid" xmlns:w16="http://schemas.microsoft.com/office/word/2018/wordml" xmlns:w16du="http://schemas.microsoft.com/office/word/2023/wordml/word16du" xmlns:w16sdtdh="http://schemas.microsoft.com/office/word/2020/wordml/sdtdatahash" xmlns:w16sdtfl="http://schemas.microsoft.com/office/word/2024/wordml/sdtformatlock" xmlns:w16se="http://schemas.microsoft.com/office/word/2015/wordml/symex" xmlns:wpg="http://schemas.microsoft.com/office/word/2010/wordprocessingGroup" xmlns:wpi="http://schemas.microsoft.com/office/word/2010/wordprocessingInk" xmlns:wne="http://schemas.microsoft.com/office/word/2006/wordml" xmlns:wps="http://schemas.microsoft.com/office/word/2010/wordprocessingShape" mc:Ignorable="w14 w15 w16se w16cid w16 w16cex w16sdtdh w16sdtfl w16du wp14">
   <w:abstractNum w:abstractNumId="0" w15:restartNumberingAfterBreak="0">
-    <w:nsid w:val="070C1A24"/>
+    <w:nsid w:val="03BA2AC6"/>
     <w:multiLevelType w:val="multilevel"/>
-    <w:tmpl w:val="0A6C1CE4"/>
-    <w:lvl w:ilvl="0">
-      <w:start w:val="1"/>
-      <w:numFmt w:val="decimal"/>
-      <w:lvlText w:val="%1."/>
-      <w:lvlJc w:val="left"/>
-      <w:pPr>
-        <w:tabs>
-          <w:tab w:val="num" w:pos="720"/>
-        </w:tabs>
-        <w:ind w:left="720" w:hanging="360"/>
-      </w:pPr>
-    </w:lvl>
-    <w:lvl w:ilvl="1" w:tentative="1">
-      <w:start w:val="1"/>
-      <w:numFmt w:val="decimal"/>
-      <w:lvlText w:val="%2."/>
-      <w:lvlJc w:val="left"/>
-      <w:pPr>
-        <w:tabs>
-          <w:tab w:val="num" w:pos="1440"/>
-        </w:tabs>
-        <w:ind w:left="1440" w:hanging="360"/>
-      </w:pPr>
-    </w:lvl>
-    <w:lvl w:ilvl="2" w:tentative="1">
-      <w:start w:val="1"/>
-      <w:numFmt w:val="decimal"/>
-      <w:lvlText w:val="%3."/>
-      <w:lvlJc w:val="left"/>
-      <w:pPr>
-        <w:tabs>
-          <w:tab w:val="num" w:pos="2160"/>
-        </w:tabs>
-        <w:ind w:left="2160" w:hanging="360"/>
-      </w:pPr>
-    </w:lvl>
-    <w:lvl w:ilvl="3" w:tentative="1">
-      <w:start w:val="1"/>
-      <w:numFmt w:val="decimal"/>
-      <w:lvlText w:val="%4."/>
-      <w:lvlJc w:val="left"/>
-      <w:pPr>
-        <w:tabs>
-          <w:tab w:val="num" w:pos="2880"/>
-        </w:tabs>
-        <w:ind w:left="2880" w:hanging="360"/>
-      </w:pPr>
-    </w:lvl>
-    <w:lvl w:ilvl="4" w:tentative="1">
-      <w:start w:val="1"/>
-      <w:numFmt w:val="decimal"/>
-      <w:lvlText w:val="%5."/>
-      <w:lvlJc w:val="left"/>
-      <w:pPr>
-        <w:tabs>
-          <w:tab w:val="num" w:pos="3600"/>
-        </w:tabs>
-        <w:ind w:left="3600" w:hanging="360"/>
-      </w:pPr>
-    </w:lvl>
-    <w:lvl w:ilvl="5" w:tentative="1">
-      <w:start w:val="1"/>
-      <w:numFmt w:val="decimal"/>
-      <w:lvlText w:val="%6."/>
-      <w:lvlJc w:val="left"/>
-      <w:pPr>
-        <w:tabs>
-          <w:tab w:val="num" w:pos="4320"/>
-        </w:tabs>
-        <w:ind w:left="4320" w:hanging="360"/>
-      </w:pPr>
-    </w:lvl>
-    <w:lvl w:ilvl="6" w:tentative="1">
-      <w:start w:val="1"/>
-      <w:numFmt w:val="decimal"/>
-      <w:lvlText w:val="%7."/>
-      <w:lvlJc w:val="left"/>
-      <w:pPr>
-        <w:tabs>
-          <w:tab w:val="num" w:pos="5040"/>
-        </w:tabs>
-        <w:ind w:left="5040" w:hanging="360"/>
-      </w:pPr>
-    </w:lvl>
-    <w:lvl w:ilvl="7" w:tentative="1">
-      <w:start w:val="1"/>
-      <w:numFmt w:val="decimal"/>
-      <w:lvlText w:val="%8."/>
-      <w:lvlJc w:val="left"/>
-      <w:pPr>
-        <w:tabs>
-          <w:tab w:val="num" w:pos="5760"/>
-        </w:tabs>
-        <w:ind w:left="5760" w:hanging="360"/>
-      </w:pPr>
-    </w:lvl>
-    <w:lvl w:ilvl="8" w:tentative="1">
-      <w:start w:val="1"/>
-      <w:numFmt w:val="decimal"/>
-      <w:lvlText w:val="%9."/>
-      <w:lvlJc w:val="left"/>
-      <w:pPr>
-        <w:tabs>
-          <w:tab w:val="num" w:pos="6480"/>
-        </w:tabs>
-        <w:ind w:left="6480" w:hanging="360"/>
-      </w:pPr>
-    </w:lvl>
-  </w:abstractNum>
-  <w:abstractNum w:abstractNumId="1" w15:restartNumberingAfterBreak="0">
-    <w:nsid w:val="0799356E"/>
-    <w:multiLevelType w:val="multilevel"/>
-    <w:tmpl w:val="FD9C00BC"/>
+    <w:tmpl w:val="42D2F1A2"/>
     <w:lvl w:ilvl="0">
       <w:start w:val="1"/>
       <w:numFmt w:val="bullet"/>
@@ -36271,10 +38509,123 @@
       </w:rPr>
     </w:lvl>
   </w:abstractNum>
+  <w:abstractNum w:abstractNumId="1" w15:restartNumberingAfterBreak="0">
+    <w:nsid w:val="051B1EE2"/>
+    <w:multiLevelType w:val="multilevel"/>
+    <w:tmpl w:val="E57C7226"/>
+    <w:lvl w:ilvl="0">
+      <w:start w:val="1"/>
+      <w:numFmt w:val="decimal"/>
+      <w:lvlText w:val="%1."/>
+      <w:lvlJc w:val="left"/>
+      <w:pPr>
+        <w:tabs>
+          <w:tab w:val="num" w:pos="720"/>
+        </w:tabs>
+        <w:ind w:left="720" w:hanging="360"/>
+      </w:pPr>
+    </w:lvl>
+    <w:lvl w:ilvl="1" w:tentative="1">
+      <w:start w:val="1"/>
+      <w:numFmt w:val="decimal"/>
+      <w:lvlText w:val="%2."/>
+      <w:lvlJc w:val="left"/>
+      <w:pPr>
+        <w:tabs>
+          <w:tab w:val="num" w:pos="1440"/>
+        </w:tabs>
+        <w:ind w:left="1440" w:hanging="360"/>
+      </w:pPr>
+    </w:lvl>
+    <w:lvl w:ilvl="2" w:tentative="1">
+      <w:start w:val="1"/>
+      <w:numFmt w:val="decimal"/>
+      <w:lvlText w:val="%3."/>
+      <w:lvlJc w:val="left"/>
+      <w:pPr>
+        <w:tabs>
+          <w:tab w:val="num" w:pos="2160"/>
+        </w:tabs>
+        <w:ind w:left="2160" w:hanging="360"/>
+      </w:pPr>
+    </w:lvl>
+    <w:lvl w:ilvl="3" w:tentative="1">
+      <w:start w:val="1"/>
+      <w:numFmt w:val="decimal"/>
+      <w:lvlText w:val="%4."/>
+      <w:lvlJc w:val="left"/>
+      <w:pPr>
+        <w:tabs>
+          <w:tab w:val="num" w:pos="2880"/>
+        </w:tabs>
+        <w:ind w:left="2880" w:hanging="360"/>
+      </w:pPr>
+    </w:lvl>
+    <w:lvl w:ilvl="4" w:tentative="1">
+      <w:start w:val="1"/>
+      <w:numFmt w:val="decimal"/>
+      <w:lvlText w:val="%5."/>
+      <w:lvlJc w:val="left"/>
+      <w:pPr>
+        <w:tabs>
+          <w:tab w:val="num" w:pos="3600"/>
+        </w:tabs>
+        <w:ind w:left="3600" w:hanging="360"/>
+      </w:pPr>
+    </w:lvl>
+    <w:lvl w:ilvl="5" w:tentative="1">
+      <w:start w:val="1"/>
+      <w:numFmt w:val="decimal"/>
+      <w:lvlText w:val="%6."/>
+      <w:lvlJc w:val="left"/>
+      <w:pPr>
+        <w:tabs>
+          <w:tab w:val="num" w:pos="4320"/>
+        </w:tabs>
+        <w:ind w:left="4320" w:hanging="360"/>
+      </w:pPr>
+    </w:lvl>
+    <w:lvl w:ilvl="6" w:tentative="1">
+      <w:start w:val="1"/>
+      <w:numFmt w:val="decimal"/>
+      <w:lvlText w:val="%7."/>
+      <w:lvlJc w:val="left"/>
+      <w:pPr>
+        <w:tabs>
+          <w:tab w:val="num" w:pos="5040"/>
+        </w:tabs>
+        <w:ind w:left="5040" w:hanging="360"/>
+      </w:pPr>
+    </w:lvl>
+    <w:lvl w:ilvl="7" w:tentative="1">
+      <w:start w:val="1"/>
+      <w:numFmt w:val="decimal"/>
+      <w:lvlText w:val="%8."/>
+      <w:lvlJc w:val="left"/>
+      <w:pPr>
+        <w:tabs>
+          <w:tab w:val="num" w:pos="5760"/>
+        </w:tabs>
+        <w:ind w:left="5760" w:hanging="360"/>
+      </w:pPr>
+    </w:lvl>
+    <w:lvl w:ilvl="8" w:tentative="1">
+      <w:start w:val="1"/>
+      <w:numFmt w:val="decimal"/>
+      <w:lvlText w:val="%9."/>
+      <w:lvlJc w:val="left"/>
+      <w:pPr>
+        <w:tabs>
+          <w:tab w:val="num" w:pos="6480"/>
+        </w:tabs>
+        <w:ind w:left="6480" w:hanging="360"/>
+      </w:pPr>
+    </w:lvl>
+  </w:abstractNum>
   <w:abstractNum w:abstractNumId="2" w15:restartNumberingAfterBreak="0">
-    <w:nsid w:val="0F9047AA"/>
+    <w:nsid w:val="0B59795B"/>
     <w:multiLevelType w:val="multilevel"/>
-    <w:tmpl w:val="1E16A806"/>
+    <w:tmpl w:val="BDE69C04"/>
     <w:lvl w:ilvl="0">
       <w:start w:val="1"/>
       <w:numFmt w:val="bullet"/>
@@ -36421,9 +38772,9 @@
     </w:lvl>
   </w:abstractNum>
   <w:abstractNum w:abstractNumId="3" w15:restartNumberingAfterBreak="0">
-    <w:nsid w:val="13F84666"/>
+    <w:nsid w:val="151466A5"/>
     <w:multiLevelType w:val="multilevel"/>
-    <w:tmpl w:val="D9C26038"/>
+    <w:tmpl w:val="3BC2E57A"/>
     <w:lvl w:ilvl="0">
       <w:start w:val="1"/>
       <w:numFmt w:val="bullet"/>
@@ -36570,13 +38921,13 @@
     </w:lvl>
   </w:abstractNum>
   <w:abstractNum w:abstractNumId="4" w15:restartNumberingAfterBreak="0">
-    <w:nsid w:val="189F2E3E"/>
+    <w:nsid w:val="185B1EA4"/>
     <w:multiLevelType w:val="multilevel"/>
-    <w:tmpl w:val="75E8AA04"/>
+    <w:tmpl w:val="5A54D196"/>
     <w:lvl w:ilvl="0">
       <w:start w:val="1"/>
-      <w:numFmt w:val="decimal"/>
-      <w:lvlText w:val="%1."/>
+      <w:numFmt w:val="bullet"/>
+      <w:lvlText w:val=""/>
       <w:lvlJc w:val="left"/>
       <w:pPr>
         <w:tabs>
@@ -36584,11 +38935,15 @@
         </w:tabs>
         <w:ind w:left="720" w:hanging="360"/>
       </w:pPr>
+      <w:rPr>
+        <w:rFonts w:ascii="Symbol" w:hAnsi="Symbol" w:hint="default"/>
+        <w:sz w:val="20"/>
+      </w:rPr>
     </w:lvl>
     <w:lvl w:ilvl="1" w:tentative="1">
       <w:start w:val="1"/>
-      <w:numFmt w:val="decimal"/>
-      <w:lvlText w:val="%2."/>
+      <w:numFmt w:val="bullet"/>
+      <w:lvlText w:val="o"/>
       <w:lvlJc w:val="left"/>
       <w:pPr>
         <w:tabs>
@@ -36596,11 +38951,15 @@
         </w:tabs>
         <w:ind w:left="1440" w:hanging="360"/>
       </w:pPr>
+      <w:rPr>
+        <w:rFonts w:ascii="Courier New" w:hAnsi="Courier New" w:hint="default"/>
+        <w:sz w:val="20"/>
+      </w:rPr>
     </w:lvl>
     <w:lvl w:ilvl="2" w:tentative="1">
       <w:start w:val="1"/>
-      <w:numFmt w:val="decimal"/>
-      <w:lvlText w:val="%3."/>
+      <w:numFmt w:val="bullet"/>
+      <w:lvlText w:val=""/>
       <w:lvlJc w:val="left"/>
       <w:pPr>
         <w:tabs>
@@ -36608,11 +38967,15 @@
         </w:tabs>
         <w:ind w:left="2160" w:hanging="360"/>
       </w:pPr>
+      <w:rPr>
+        <w:rFonts w:ascii="Wingdings" w:hAnsi="Wingdings" w:hint="default"/>
+        <w:sz w:val="20"/>
+      </w:rPr>
     </w:lvl>
     <w:lvl w:ilvl="3" w:tentative="1">
       <w:start w:val="1"/>
-      <w:numFmt w:val="decimal"/>
-      <w:lvlText w:val="%4."/>
+      <w:numFmt w:val="bullet"/>
+      <w:lvlText w:val=""/>
       <w:lvlJc w:val="left"/>
       <w:pPr>
         <w:tabs>
@@ -36620,11 +38983,15 @@
         </w:tabs>
         <w:ind w:left="2880" w:hanging="360"/>
       </w:pPr>
+      <w:rPr>
+        <w:rFonts w:ascii="Wingdings" w:hAnsi="Wingdings" w:hint="default"/>
+        <w:sz w:val="20"/>
+      </w:rPr>
     </w:lvl>
     <w:lvl w:ilvl="4" w:tentative="1">
       <w:start w:val="1"/>
-      <w:numFmt w:val="decimal"/>
-      <w:lvlText w:val="%5."/>
+      <w:numFmt w:val="bullet"/>
+      <w:lvlText w:val=""/>
       <w:lvlJc w:val="left"/>
       <w:pPr>
         <w:tabs>
@@ -36632,11 +38999,15 @@
         </w:tabs>
         <w:ind w:left="3600" w:hanging="360"/>
       </w:pPr>
+      <w:rPr>
+        <w:rFonts w:ascii="Wingdings" w:hAnsi="Wingdings" w:hint="default"/>
+        <w:sz w:val="20"/>
+      </w:rPr>
     </w:lvl>
     <w:lvl w:ilvl="5" w:tentative="1">
       <w:start w:val="1"/>
-      <w:numFmt w:val="decimal"/>
-      <w:lvlText w:val="%6."/>
+      <w:numFmt w:val="bullet"/>
+      <w:lvlText w:val=""/>
       <w:lvlJc w:val="left"/>
       <w:pPr>
         <w:tabs>
@@ -36644,11 +39015,15 @@
         </w:tabs>
         <w:ind w:left="4320" w:hanging="360"/>
       </w:pPr>
+      <w:rPr>
+        <w:rFonts w:ascii="Wingdings" w:hAnsi="Wingdings" w:hint="default"/>
+        <w:sz w:val="20"/>
+      </w:rPr>
     </w:lvl>
     <w:lvl w:ilvl="6" w:tentative="1">
       <w:start w:val="1"/>
-      <w:numFmt w:val="decimal"/>
-      <w:lvlText w:val="%7."/>
+      <w:numFmt w:val="bullet"/>
+      <w:lvlText w:val=""/>
       <w:lvlJc w:val="left"/>
       <w:pPr>
         <w:tabs>
@@ -36656,11 +39031,15 @@
         </w:tabs>
         <w:ind w:left="5040" w:hanging="360"/>
       </w:pPr>
+      <w:rPr>
+        <w:rFonts w:ascii="Wingdings" w:hAnsi="Wingdings" w:hint="default"/>
+        <w:sz w:val="20"/>
+      </w:rPr>
     </w:lvl>
     <w:lvl w:ilvl="7" w:tentative="1">
       <w:start w:val="1"/>
-      <w:numFmt w:val="decimal"/>
-      <w:lvlText w:val="%8."/>
+      <w:numFmt w:val="bullet"/>
+      <w:lvlText w:val=""/>
       <w:lvlJc w:val="left"/>
       <w:pPr>
         <w:tabs>
@@ -36668,11 +39047,15 @@
         </w:tabs>
         <w:ind w:left="5760" w:hanging="360"/>
       </w:pPr>
+      <w:rPr>
+        <w:rFonts w:ascii="Wingdings" w:hAnsi="Wingdings" w:hint="default"/>
+        <w:sz w:val="20"/>
+      </w:rPr>
     </w:lvl>
     <w:lvl w:ilvl="8" w:tentative="1">
       <w:start w:val="1"/>
-      <w:numFmt w:val="decimal"/>
-      <w:lvlText w:val="%9."/>
+      <w:numFmt w:val="bullet"/>
+      <w:lvlText w:val=""/>
       <w:lvlJc w:val="left"/>
       <w:pPr>
         <w:tabs>
@@ -36680,12 +39063,16 @@
         </w:tabs>
         <w:ind w:left="6480" w:hanging="360"/>
       </w:pPr>
+      <w:rPr>
+        <w:rFonts w:ascii="Wingdings" w:hAnsi="Wingdings" w:hint="default"/>
+        <w:sz w:val="20"/>
+      </w:rPr>
     </w:lvl>
   </w:abstractNum>
   <w:abstractNum w:abstractNumId="5" w15:restartNumberingAfterBreak="0">
-    <w:nsid w:val="26B64630"/>
+    <w:nsid w:val="1C2D2857"/>
     <w:multiLevelType w:val="multilevel"/>
-    <w:tmpl w:val="B0A2B82A"/>
+    <w:tmpl w:val="B622AF52"/>
     <w:lvl w:ilvl="0">
       <w:start w:val="1"/>
       <w:numFmt w:val="bullet"/>
@@ -36832,9 +39219,9 @@
     </w:lvl>
   </w:abstractNum>
   <w:abstractNum w:abstractNumId="6" w15:restartNumberingAfterBreak="0">
-    <w:nsid w:val="29E025A1"/>
+    <w:nsid w:val="22AF4BDC"/>
     <w:multiLevelType w:val="multilevel"/>
-    <w:tmpl w:val="B4F499D8"/>
+    <w:tmpl w:val="DE2853CA"/>
     <w:lvl w:ilvl="0">
       <w:start w:val="1"/>
       <w:numFmt w:val="bullet"/>
@@ -36981,9 +39368,9 @@
     </w:lvl>
   </w:abstractNum>
   <w:abstractNum w:abstractNumId="7" w15:restartNumberingAfterBreak="0">
-    <w:nsid w:val="30462EC7"/>
+    <w:nsid w:val="37B90002"/>
     <w:multiLevelType w:val="multilevel"/>
-    <w:tmpl w:val="660C704C"/>
+    <w:tmpl w:val="E9DAD110"/>
     <w:lvl w:ilvl="0">
       <w:start w:val="1"/>
       <w:numFmt w:val="bullet"/>
@@ -37130,9 +39517,9 @@
     </w:lvl>
   </w:abstractNum>
   <w:abstractNum w:abstractNumId="8" w15:restartNumberingAfterBreak="0">
-    <w:nsid w:val="3E520723"/>
+    <w:nsid w:val="38A95D4D"/>
     <w:multiLevelType w:val="multilevel"/>
-    <w:tmpl w:val="D1264E38"/>
+    <w:tmpl w:val="5BEA77B2"/>
     <w:lvl w:ilvl="0">
       <w:start w:val="1"/>
       <w:numFmt w:val="bullet"/>
@@ -37279,9 +39666,9 @@
     </w:lvl>
   </w:abstractNum>
   <w:abstractNum w:abstractNumId="9" w15:restartNumberingAfterBreak="0">
-    <w:nsid w:val="4178513F"/>
+    <w:nsid w:val="3AEF22AC"/>
     <w:multiLevelType w:val="multilevel"/>
-    <w:tmpl w:val="2DB87C04"/>
+    <w:tmpl w:val="D43EEF54"/>
     <w:lvl w:ilvl="0">
       <w:start w:val="1"/>
       <w:numFmt w:val="bullet"/>
@@ -37298,7 +39685,7 @@
         <w:sz w:val="20"/>
       </w:rPr>
     </w:lvl>
-    <w:lvl w:ilvl="1" w:tentative="1">
+    <w:lvl w:ilvl="1">
       <w:start w:val="1"/>
       <w:numFmt w:val="bullet"/>
       <w:lvlText w:val="o"/>
@@ -37428,9 +39815,9 @@
     </w:lvl>
   </w:abstractNum>
   <w:abstractNum w:abstractNumId="10" w15:restartNumberingAfterBreak="0">
-    <w:nsid w:val="446465F9"/>
+    <w:nsid w:val="480946FA"/>
     <w:multiLevelType w:val="multilevel"/>
-    <w:tmpl w:val="82DCA19A"/>
+    <w:tmpl w:val="33243C16"/>
     <w:lvl w:ilvl="0">
       <w:start w:val="1"/>
       <w:numFmt w:val="bullet"/>
@@ -37577,271 +39964,9 @@
     </w:lvl>
   </w:abstractNum>
   <w:abstractNum w:abstractNumId="11" w15:restartNumberingAfterBreak="0">
-    <w:nsid w:val="45546A92"/>
+    <w:nsid w:val="49EE73DB"/>
     <w:multiLevelType w:val="multilevel"/>
-    <w:tmpl w:val="59C8EA7C"/>
-    <w:lvl w:ilvl="0">
-      <w:start w:val="1"/>
-      <w:numFmt w:val="bullet"/>
-      <w:lvlText w:val=""/>
-      <w:lvlJc w:val="left"/>
-      <w:pPr>
-        <w:tabs>
-          <w:tab w:val="num" w:pos="720"/>
-        </w:tabs>
-        <w:ind w:left="720" w:hanging="360"/>
-      </w:pPr>
-      <w:rPr>
-        <w:rFonts w:ascii="Symbol" w:hAnsi="Symbol" w:hint="default"/>
-        <w:sz w:val="20"/>
-      </w:rPr>
-    </w:lvl>
-    <w:lvl w:ilvl="1">
-      <w:start w:val="1"/>
-      <w:numFmt w:val="bullet"/>
-      <w:lvlText w:val="o"/>
-      <w:lvlJc w:val="left"/>
-      <w:pPr>
-        <w:tabs>
-          <w:tab w:val="num" w:pos="1440"/>
-        </w:tabs>
-        <w:ind w:left="1440" w:hanging="360"/>
-      </w:pPr>
-      <w:rPr>
-        <w:rFonts w:ascii="Courier New" w:hAnsi="Courier New" w:hint="default"/>
-        <w:sz w:val="20"/>
-      </w:rPr>
-    </w:lvl>
-    <w:lvl w:ilvl="2" w:tentative="1">
-      <w:start w:val="1"/>
-      <w:numFmt w:val="bullet"/>
-      <w:lvlText w:val=""/>
-      <w:lvlJc w:val="left"/>
-      <w:pPr>
-        <w:tabs>
-          <w:tab w:val="num" w:pos="2160"/>
-        </w:tabs>
-        <w:ind w:left="2160" w:hanging="360"/>
-      </w:pPr>
-      <w:rPr>
-        <w:rFonts w:ascii="Wingdings" w:hAnsi="Wingdings" w:hint="default"/>
-        <w:sz w:val="20"/>
-      </w:rPr>
-    </w:lvl>
-    <w:lvl w:ilvl="3" w:tentative="1">
-      <w:start w:val="1"/>
-      <w:numFmt w:val="bullet"/>
-      <w:lvlText w:val=""/>
-      <w:lvlJc w:val="left"/>
-      <w:pPr>
-        <w:tabs>
-          <w:tab w:val="num" w:pos="2880"/>
-        </w:tabs>
-        <w:ind w:left="2880" w:hanging="360"/>
-      </w:pPr>
-      <w:rPr>
-        <w:rFonts w:ascii="Wingdings" w:hAnsi="Wingdings" w:hint="default"/>
-        <w:sz w:val="20"/>
-      </w:rPr>
-    </w:lvl>
-    <w:lvl w:ilvl="4" w:tentative="1">
-      <w:start w:val="1"/>
-      <w:numFmt w:val="bullet"/>
-      <w:lvlText w:val=""/>
-      <w:lvlJc w:val="left"/>
-      <w:pPr>
-        <w:tabs>
-          <w:tab w:val="num" w:pos="3600"/>
-        </w:tabs>
-        <w:ind w:left="3600" w:hanging="360"/>
-      </w:pPr>
-      <w:rPr>
-        <w:rFonts w:ascii="Wingdings" w:hAnsi="Wingdings" w:hint="default"/>
-        <w:sz w:val="20"/>
-      </w:rPr>
-    </w:lvl>
-    <w:lvl w:ilvl="5" w:tentative="1">
-      <w:start w:val="1"/>
-      <w:numFmt w:val="bullet"/>
-      <w:lvlText w:val=""/>
-      <w:lvlJc w:val="left"/>
-      <w:pPr>
-        <w:tabs>
-          <w:tab w:val="num" w:pos="4320"/>
-        </w:tabs>
-        <w:ind w:left="4320" w:hanging="360"/>
-      </w:pPr>
-      <w:rPr>
-        <w:rFonts w:ascii="Wingdings" w:hAnsi="Wingdings" w:hint="default"/>
-        <w:sz w:val="20"/>
-      </w:rPr>
-    </w:lvl>
-    <w:lvl w:ilvl="6" w:tentative="1">
-      <w:start w:val="1"/>
-      <w:numFmt w:val="bullet"/>
-      <w:lvlText w:val=""/>
-      <w:lvlJc w:val="left"/>
-      <w:pPr>
-        <w:tabs>
-          <w:tab w:val="num" w:pos="5040"/>
-        </w:tabs>
-        <w:ind w:left="5040" w:hanging="360"/>
-      </w:pPr>
-      <w:rPr>
-        <w:rFonts w:ascii="Wingdings" w:hAnsi="Wingdings" w:hint="default"/>
-        <w:sz w:val="20"/>
-      </w:rPr>
-    </w:lvl>
-    <w:lvl w:ilvl="7" w:tentative="1">
-      <w:start w:val="1"/>
-      <w:numFmt w:val="bullet"/>
-      <w:lvlText w:val=""/>
-      <w:lvlJc w:val="left"/>
-      <w:pPr>
-        <w:tabs>
-          <w:tab w:val="num" w:pos="5760"/>
-        </w:tabs>
-        <w:ind w:left="5760" w:hanging="360"/>
-      </w:pPr>
-      <w:rPr>
-        <w:rFonts w:ascii="Wingdings" w:hAnsi="Wingdings" w:hint="default"/>
-        <w:sz w:val="20"/>
-      </w:rPr>
-    </w:lvl>
-    <w:lvl w:ilvl="8" w:tentative="1">
-      <w:start w:val="1"/>
-      <w:numFmt w:val="bullet"/>
-      <w:lvlText w:val=""/>
-      <w:lvlJc w:val="left"/>
-      <w:pPr>
-        <w:tabs>
-          <w:tab w:val="num" w:pos="6480"/>
-        </w:tabs>
-        <w:ind w:left="6480" w:hanging="360"/>
-      </w:pPr>
-      <w:rPr>
-        <w:rFonts w:ascii="Wingdings" w:hAnsi="Wingdings" w:hint="default"/>
-        <w:sz w:val="20"/>
-      </w:rPr>
-    </w:lvl>
-  </w:abstractNum>
-  <w:abstractNum w:abstractNumId="12" w15:restartNumberingAfterBreak="0">
-    <w:nsid w:val="4CFC3511"/>
-    <w:multiLevelType w:val="multilevel"/>
-    <w:tmpl w:val="17D4A760"/>
-    <w:lvl w:ilvl="0">
-      <w:start w:val="1"/>
-      <w:numFmt w:val="decimal"/>
-      <w:lvlText w:val="%1."/>
-      <w:lvlJc w:val="left"/>
-      <w:pPr>
-        <w:tabs>
-          <w:tab w:val="num" w:pos="720"/>
-        </w:tabs>
-        <w:ind w:left="720" w:hanging="360"/>
-      </w:pPr>
-    </w:lvl>
-    <w:lvl w:ilvl="1" w:tentative="1">
-      <w:start w:val="1"/>
-      <w:numFmt w:val="decimal"/>
-      <w:lvlText w:val="%2."/>
-      <w:lvlJc w:val="left"/>
-      <w:pPr>
-        <w:tabs>
-          <w:tab w:val="num" w:pos="1440"/>
-        </w:tabs>
-        <w:ind w:left="1440" w:hanging="360"/>
-      </w:pPr>
-    </w:lvl>
-    <w:lvl w:ilvl="2" w:tentative="1">
-      <w:start w:val="1"/>
-      <w:numFmt w:val="decimal"/>
-      <w:lvlText w:val="%3."/>
-      <w:lvlJc w:val="left"/>
-      <w:pPr>
-        <w:tabs>
-          <w:tab w:val="num" w:pos="2160"/>
-        </w:tabs>
-        <w:ind w:left="2160" w:hanging="360"/>
-      </w:pPr>
-    </w:lvl>
-    <w:lvl w:ilvl="3" w:tentative="1">
-      <w:start w:val="1"/>
-      <w:numFmt w:val="decimal"/>
-      <w:lvlText w:val="%4."/>
-      <w:lvlJc w:val="left"/>
-      <w:pPr>
-        <w:tabs>
-          <w:tab w:val="num" w:pos="2880"/>
-        </w:tabs>
-        <w:ind w:left="2880" w:hanging="360"/>
-      </w:pPr>
-    </w:lvl>
-    <w:lvl w:ilvl="4" w:tentative="1">
-      <w:start w:val="1"/>
-      <w:numFmt w:val="decimal"/>
-      <w:lvlText w:val="%5."/>
-      <w:lvlJc w:val="left"/>
-      <w:pPr>
-        <w:tabs>
-          <w:tab w:val="num" w:pos="3600"/>
-        </w:tabs>
-        <w:ind w:left="3600" w:hanging="360"/>
-      </w:pPr>
-    </w:lvl>
-    <w:lvl w:ilvl="5" w:tentative="1">
-      <w:start w:val="1"/>
-      <w:numFmt w:val="decimal"/>
-      <w:lvlText w:val="%6."/>
-      <w:lvlJc w:val="left"/>
-      <w:pPr>
-        <w:tabs>
-          <w:tab w:val="num" w:pos="4320"/>
-        </w:tabs>
-        <w:ind w:left="4320" w:hanging="360"/>
-      </w:pPr>
-    </w:lvl>
-    <w:lvl w:ilvl="6" w:tentative="1">
-      <w:start w:val="1"/>
-      <w:numFmt w:val="decimal"/>
-      <w:lvlText w:val="%7."/>
-      <w:lvlJc w:val="left"/>
-      <w:pPr>
-        <w:tabs>
-          <w:tab w:val="num" w:pos="5040"/>
-        </w:tabs>
-        <w:ind w:left="5040" w:hanging="360"/>
-      </w:pPr>
-    </w:lvl>
-    <w:lvl w:ilvl="7" w:tentative="1">
-      <w:start w:val="1"/>
-      <w:numFmt w:val="decimal"/>
-      <w:lvlText w:val="%8."/>
-      <w:lvlJc w:val="left"/>
-      <w:pPr>
-        <w:tabs>
-          <w:tab w:val="num" w:pos="5760"/>
-        </w:tabs>
-        <w:ind w:left="5760" w:hanging="360"/>
-      </w:pPr>
-    </w:lvl>
-    <w:lvl w:ilvl="8" w:tentative="1">
-      <w:start w:val="1"/>
-      <w:numFmt w:val="decimal"/>
-      <w:lvlText w:val="%9."/>
-      <w:lvlJc w:val="left"/>
-      <w:pPr>
-        <w:tabs>
-          <w:tab w:val="num" w:pos="6480"/>
-        </w:tabs>
-        <w:ind w:left="6480" w:hanging="360"/>
-      </w:pPr>
-    </w:lvl>
-  </w:abstractNum>
-  <w:abstractNum w:abstractNumId="13" w15:restartNumberingAfterBreak="0">
-    <w:nsid w:val="55F609A1"/>
-    <w:multiLevelType w:val="multilevel"/>
-    <w:tmpl w:val="3B9ADA94"/>
+    <w:tmpl w:val="E54641F2"/>
     <w:lvl w:ilvl="0">
       <w:start w:val="1"/>
       <w:numFmt w:val="bullet"/>
@@ -37987,10 +40112,272 @@
       </w:rPr>
     </w:lvl>
   </w:abstractNum>
+  <w:abstractNum w:abstractNumId="12" w15:restartNumberingAfterBreak="0">
+    <w:nsid w:val="4EA96EA0"/>
+    <w:multiLevelType w:val="multilevel"/>
+    <w:tmpl w:val="61AC597C"/>
+    <w:lvl w:ilvl="0">
+      <w:start w:val="1"/>
+      <w:numFmt w:val="bullet"/>
+      <w:lvlText w:val=""/>
+      <w:lvlJc w:val="left"/>
+      <w:pPr>
+        <w:tabs>
+          <w:tab w:val="num" w:pos="720"/>
+        </w:tabs>
+        <w:ind w:left="720" w:hanging="360"/>
+      </w:pPr>
+      <w:rPr>
+        <w:rFonts w:ascii="Symbol" w:hAnsi="Symbol" w:hint="default"/>
+        <w:sz w:val="20"/>
+      </w:rPr>
+    </w:lvl>
+    <w:lvl w:ilvl="1" w:tentative="1">
+      <w:start w:val="1"/>
+      <w:numFmt w:val="bullet"/>
+      <w:lvlText w:val="o"/>
+      <w:lvlJc w:val="left"/>
+      <w:pPr>
+        <w:tabs>
+          <w:tab w:val="num" w:pos="1440"/>
+        </w:tabs>
+        <w:ind w:left="1440" w:hanging="360"/>
+      </w:pPr>
+      <w:rPr>
+        <w:rFonts w:ascii="Courier New" w:hAnsi="Courier New" w:hint="default"/>
+        <w:sz w:val="20"/>
+      </w:rPr>
+    </w:lvl>
+    <w:lvl w:ilvl="2" w:tentative="1">
+      <w:start w:val="1"/>
+      <w:numFmt w:val="bullet"/>
+      <w:lvlText w:val=""/>
+      <w:lvlJc w:val="left"/>
+      <w:pPr>
+        <w:tabs>
+          <w:tab w:val="num" w:pos="2160"/>
+        </w:tabs>
+        <w:ind w:left="2160" w:hanging="360"/>
+      </w:pPr>
+      <w:rPr>
+        <w:rFonts w:ascii="Wingdings" w:hAnsi="Wingdings" w:hint="default"/>
+        <w:sz w:val="20"/>
+      </w:rPr>
+    </w:lvl>
+    <w:lvl w:ilvl="3" w:tentative="1">
+      <w:start w:val="1"/>
+      <w:numFmt w:val="bullet"/>
+      <w:lvlText w:val=""/>
+      <w:lvlJc w:val="left"/>
+      <w:pPr>
+        <w:tabs>
+          <w:tab w:val="num" w:pos="2880"/>
+        </w:tabs>
+        <w:ind w:left="2880" w:hanging="360"/>
+      </w:pPr>
+      <w:rPr>
+        <w:rFonts w:ascii="Wingdings" w:hAnsi="Wingdings" w:hint="default"/>
+        <w:sz w:val="20"/>
+      </w:rPr>
+    </w:lvl>
+    <w:lvl w:ilvl="4" w:tentative="1">
+      <w:start w:val="1"/>
+      <w:numFmt w:val="bullet"/>
+      <w:lvlText w:val=""/>
+      <w:lvlJc w:val="left"/>
+      <w:pPr>
+        <w:tabs>
+          <w:tab w:val="num" w:pos="3600"/>
+        </w:tabs>
+        <w:ind w:left="3600" w:hanging="360"/>
+      </w:pPr>
+      <w:rPr>
+        <w:rFonts w:ascii="Wingdings" w:hAnsi="Wingdings" w:hint="default"/>
+        <w:sz w:val="20"/>
+      </w:rPr>
+    </w:lvl>
+    <w:lvl w:ilvl="5" w:tentative="1">
+      <w:start w:val="1"/>
+      <w:numFmt w:val="bullet"/>
+      <w:lvlText w:val=""/>
+      <w:lvlJc w:val="left"/>
+      <w:pPr>
+        <w:tabs>
+          <w:tab w:val="num" w:pos="4320"/>
+        </w:tabs>
+        <w:ind w:left="4320" w:hanging="360"/>
+      </w:pPr>
+      <w:rPr>
+        <w:rFonts w:ascii="Wingdings" w:hAnsi="Wingdings" w:hint="default"/>
+        <w:sz w:val="20"/>
+      </w:rPr>
+    </w:lvl>
+    <w:lvl w:ilvl="6" w:tentative="1">
+      <w:start w:val="1"/>
+      <w:numFmt w:val="bullet"/>
+      <w:lvlText w:val=""/>
+      <w:lvlJc w:val="left"/>
+      <w:pPr>
+        <w:tabs>
+          <w:tab w:val="num" w:pos="5040"/>
+        </w:tabs>
+        <w:ind w:left="5040" w:hanging="360"/>
+      </w:pPr>
+      <w:rPr>
+        <w:rFonts w:ascii="Wingdings" w:hAnsi="Wingdings" w:hint="default"/>
+        <w:sz w:val="20"/>
+      </w:rPr>
+    </w:lvl>
+    <w:lvl w:ilvl="7" w:tentative="1">
+      <w:start w:val="1"/>
+      <w:numFmt w:val="bullet"/>
+      <w:lvlText w:val=""/>
+      <w:lvlJc w:val="left"/>
+      <w:pPr>
+        <w:tabs>
+          <w:tab w:val="num" w:pos="5760"/>
+        </w:tabs>
+        <w:ind w:left="5760" w:hanging="360"/>
+      </w:pPr>
+      <w:rPr>
+        <w:rFonts w:ascii="Wingdings" w:hAnsi="Wingdings" w:hint="default"/>
+        <w:sz w:val="20"/>
+      </w:rPr>
+    </w:lvl>
+    <w:lvl w:ilvl="8" w:tentative="1">
+      <w:start w:val="1"/>
+      <w:numFmt w:val="bullet"/>
+      <w:lvlText w:val=""/>
+      <w:lvlJc w:val="left"/>
+      <w:pPr>
+        <w:tabs>
+          <w:tab w:val="num" w:pos="6480"/>
+        </w:tabs>
+        <w:ind w:left="6480" w:hanging="360"/>
+      </w:pPr>
+      <w:rPr>
+        <w:rFonts w:ascii="Wingdings" w:hAnsi="Wingdings" w:hint="default"/>
+        <w:sz w:val="20"/>
+      </w:rPr>
+    </w:lvl>
+  </w:abstractNum>
+  <w:abstractNum w:abstractNumId="13" w15:restartNumberingAfterBreak="0">
+    <w:nsid w:val="5107413F"/>
+    <w:multiLevelType w:val="multilevel"/>
+    <w:tmpl w:val="BB88C0B2"/>
+    <w:lvl w:ilvl="0">
+      <w:start w:val="1"/>
+      <w:numFmt w:val="decimal"/>
+      <w:lvlText w:val="%1."/>
+      <w:lvlJc w:val="left"/>
+      <w:pPr>
+        <w:tabs>
+          <w:tab w:val="num" w:pos="720"/>
+        </w:tabs>
+        <w:ind w:left="720" w:hanging="360"/>
+      </w:pPr>
+    </w:lvl>
+    <w:lvl w:ilvl="1" w:tentative="1">
+      <w:start w:val="1"/>
+      <w:numFmt w:val="decimal"/>
+      <w:lvlText w:val="%2."/>
+      <w:lvlJc w:val="left"/>
+      <w:pPr>
+        <w:tabs>
+          <w:tab w:val="num" w:pos="1440"/>
+        </w:tabs>
+        <w:ind w:left="1440" w:hanging="360"/>
+      </w:pPr>
+    </w:lvl>
+    <w:lvl w:ilvl="2" w:tentative="1">
+      <w:start w:val="1"/>
+      <w:numFmt w:val="decimal"/>
+      <w:lvlText w:val="%3."/>
+      <w:lvlJc w:val="left"/>
+      <w:pPr>
+        <w:tabs>
+          <w:tab w:val="num" w:pos="2160"/>
+        </w:tabs>
+        <w:ind w:left="2160" w:hanging="360"/>
+      </w:pPr>
+    </w:lvl>
+    <w:lvl w:ilvl="3" w:tentative="1">
+      <w:start w:val="1"/>
+      <w:numFmt w:val="decimal"/>
+      <w:lvlText w:val="%4."/>
+      <w:lvlJc w:val="left"/>
+      <w:pPr>
+        <w:tabs>
+          <w:tab w:val="num" w:pos="2880"/>
+        </w:tabs>
+        <w:ind w:left="2880" w:hanging="360"/>
+      </w:pPr>
+    </w:lvl>
+    <w:lvl w:ilvl="4" w:tentative="1">
+      <w:start w:val="1"/>
+      <w:numFmt w:val="decimal"/>
+      <w:lvlText w:val="%5."/>
+      <w:lvlJc w:val="left"/>
+      <w:pPr>
+        <w:tabs>
+          <w:tab w:val="num" w:pos="3600"/>
+        </w:tabs>
+        <w:ind w:left="3600" w:hanging="360"/>
+      </w:pPr>
+    </w:lvl>
+    <w:lvl w:ilvl="5" w:tentative="1">
+      <w:start w:val="1"/>
+      <w:numFmt w:val="decimal"/>
+      <w:lvlText w:val="%6."/>
+      <w:lvlJc w:val="left"/>
+      <w:pPr>
+        <w:tabs>
+          <w:tab w:val="num" w:pos="4320"/>
+        </w:tabs>
+        <w:ind w:left="4320" w:hanging="360"/>
+      </w:pPr>
+    </w:lvl>
+    <w:lvl w:ilvl="6" w:tentative="1">
+      <w:start w:val="1"/>
+      <w:numFmt w:val="decimal"/>
+      <w:lvlText w:val="%7."/>
+      <w:lvlJc w:val="left"/>
+      <w:pPr>
+        <w:tabs>
+          <w:tab w:val="num" w:pos="5040"/>
+        </w:tabs>
+        <w:ind w:left="5040" w:hanging="360"/>
+      </w:pPr>
+    </w:lvl>
+    <w:lvl w:ilvl="7" w:tentative="1">
+      <w:start w:val="1"/>
+      <w:numFmt w:val="decimal"/>
+      <w:lvlText w:val="%8."/>
+      <w:lvlJc w:val="left"/>
+      <w:pPr>
+        <w:tabs>
+          <w:tab w:val="num" w:pos="5760"/>
+        </w:tabs>
+        <w:ind w:left="5760" w:hanging="360"/>
+      </w:pPr>
+    </w:lvl>
+    <w:lvl w:ilvl="8" w:tentative="1">
+      <w:start w:val="1"/>
+      <w:numFmt w:val="decimal"/>
+      <w:lvlText w:val="%9."/>
+      <w:lvlJc w:val="left"/>
+      <w:pPr>
+        <w:tabs>
+          <w:tab w:val="num" w:pos="6480"/>
+        </w:tabs>
+        <w:ind w:left="6480" w:hanging="360"/>
+      </w:pPr>
+    </w:lvl>
+  </w:abstractNum>
   <w:abstractNum w:abstractNumId="14" w15:restartNumberingAfterBreak="0">
-    <w:nsid w:val="57577860"/>
+    <w:nsid w:val="66FB7CE7"/>
     <w:multiLevelType w:val="multilevel"/>
-    <w:tmpl w:val="A99E91E4"/>
+    <w:tmpl w:val="ECDEA696"/>
     <w:lvl w:ilvl="0">
       <w:start w:val="1"/>
       <w:numFmt w:val="bullet"/>
@@ -38137,9 +40524,9 @@
     </w:lvl>
   </w:abstractNum>
   <w:abstractNum w:abstractNumId="15" w15:restartNumberingAfterBreak="0">
-    <w:nsid w:val="62CC091B"/>
+    <w:nsid w:val="72D11827"/>
     <w:multiLevelType w:val="multilevel"/>
-    <w:tmpl w:val="2774D1E8"/>
+    <w:tmpl w:val="7E32E2B6"/>
     <w:lvl w:ilvl="0">
       <w:start w:val="1"/>
       <w:numFmt w:val="bullet"/>
@@ -38286,9 +40673,9 @@
     </w:lvl>
   </w:abstractNum>
   <w:abstractNum w:abstractNumId="16" w15:restartNumberingAfterBreak="0">
-    <w:nsid w:val="739E3D42"/>
+    <w:nsid w:val="7608722F"/>
     <w:multiLevelType w:val="multilevel"/>
-    <w:tmpl w:val="0082BC98"/>
+    <w:tmpl w:val="340036C6"/>
     <w:lvl w:ilvl="0">
       <w:start w:val="1"/>
       <w:numFmt w:val="bullet"/>
@@ -38434,56 +40821,172 @@
       </w:rPr>
     </w:lvl>
   </w:abstractNum>
-  <w:num w:numId="1" w16cid:durableId="1169565324">
+  <w:abstractNum w:abstractNumId="17" w15:restartNumberingAfterBreak="0">
+    <w:nsid w:val="771D6194"/>
+    <w:multiLevelType w:val="multilevel"/>
+    <w:tmpl w:val="82EE86E0"/>
+    <w:lvl w:ilvl="0">
+      <w:start w:val="1"/>
+      <w:numFmt w:val="decimal"/>
+      <w:lvlText w:val="%1."/>
+      <w:lvlJc w:val="left"/>
+      <w:pPr>
+        <w:tabs>
+          <w:tab w:val="num" w:pos="720"/>
+        </w:tabs>
+        <w:ind w:left="720" w:hanging="360"/>
+      </w:pPr>
+    </w:lvl>
+    <w:lvl w:ilvl="1" w:tentative="1">
+      <w:start w:val="1"/>
+      <w:numFmt w:val="decimal"/>
+      <w:lvlText w:val="%2."/>
+      <w:lvlJc w:val="left"/>
+      <w:pPr>
+        <w:tabs>
+          <w:tab w:val="num" w:pos="1440"/>
+        </w:tabs>
+        <w:ind w:left="1440" w:hanging="360"/>
+      </w:pPr>
+    </w:lvl>
+    <w:lvl w:ilvl="2" w:tentative="1">
+      <w:start w:val="1"/>
+      <w:numFmt w:val="decimal"/>
+      <w:lvlText w:val="%3."/>
+      <w:lvlJc w:val="left"/>
+      <w:pPr>
+        <w:tabs>
+          <w:tab w:val="num" w:pos="2160"/>
+        </w:tabs>
+        <w:ind w:left="2160" w:hanging="360"/>
+      </w:pPr>
+    </w:lvl>
+    <w:lvl w:ilvl="3" w:tentative="1">
+      <w:start w:val="1"/>
+      <w:numFmt w:val="decimal"/>
+      <w:lvlText w:val="%4."/>
+      <w:lvlJc w:val="left"/>
+      <w:pPr>
+        <w:tabs>
+          <w:tab w:val="num" w:pos="2880"/>
+        </w:tabs>
+        <w:ind w:left="2880" w:hanging="360"/>
+      </w:pPr>
+    </w:lvl>
+    <w:lvl w:ilvl="4" w:tentative="1">
+      <w:start w:val="1"/>
+      <w:numFmt w:val="decimal"/>
+      <w:lvlText w:val="%5."/>
+      <w:lvlJc w:val="left"/>
+      <w:pPr>
+        <w:tabs>
+          <w:tab w:val="num" w:pos="3600"/>
+        </w:tabs>
+        <w:ind w:left="3600" w:hanging="360"/>
+      </w:pPr>
+    </w:lvl>
+    <w:lvl w:ilvl="5" w:tentative="1">
+      <w:start w:val="1"/>
+      <w:numFmt w:val="decimal"/>
+      <w:lvlText w:val="%6."/>
+      <w:lvlJc w:val="left"/>
+      <w:pPr>
+        <w:tabs>
+          <w:tab w:val="num" w:pos="4320"/>
+        </w:tabs>
+        <w:ind w:left="4320" w:hanging="360"/>
+      </w:pPr>
+    </w:lvl>
+    <w:lvl w:ilvl="6" w:tentative="1">
+      <w:start w:val="1"/>
+      <w:numFmt w:val="decimal"/>
+      <w:lvlText w:val="%7."/>
+      <w:lvlJc w:val="left"/>
+      <w:pPr>
+        <w:tabs>
+          <w:tab w:val="num" w:pos="5040"/>
+        </w:tabs>
+        <w:ind w:left="5040" w:hanging="360"/>
+      </w:pPr>
+    </w:lvl>
+    <w:lvl w:ilvl="7" w:tentative="1">
+      <w:start w:val="1"/>
+      <w:numFmt w:val="decimal"/>
+      <w:lvlText w:val="%8."/>
+      <w:lvlJc w:val="left"/>
+      <w:pPr>
+        <w:tabs>
+          <w:tab w:val="num" w:pos="5760"/>
+        </w:tabs>
+        <w:ind w:left="5760" w:hanging="360"/>
+      </w:pPr>
+    </w:lvl>
+    <w:lvl w:ilvl="8" w:tentative="1">
+      <w:start w:val="1"/>
+      <w:numFmt w:val="decimal"/>
+      <w:lvlText w:val="%9."/>
+      <w:lvlJc w:val="left"/>
+      <w:pPr>
+        <w:tabs>
+          <w:tab w:val="num" w:pos="6480"/>
+        </w:tabs>
+        <w:ind w:left="6480" w:hanging="360"/>
+      </w:pPr>
+    </w:lvl>
+  </w:abstractNum>
+  <w:num w:numId="1" w16cid:durableId="1727683726">
     <w:abstractNumId w:val="16"/>
   </w:num>
-  <w:num w:numId="2" w16cid:durableId="1433669572">
+  <w:num w:numId="2" w16cid:durableId="1453789421">
+    <w:abstractNumId w:val="17"/>
+  </w:num>
+  <w:num w:numId="3" w16cid:durableId="71464757">
+    <w:abstractNumId w:val="9"/>
+  </w:num>
+  <w:num w:numId="4" w16cid:durableId="1470128945">
+    <w:abstractNumId w:val="1"/>
+  </w:num>
+  <w:num w:numId="5" w16cid:durableId="146636129">
+    <w:abstractNumId w:val="13"/>
+  </w:num>
+  <w:num w:numId="6" w16cid:durableId="1897813718">
+    <w:abstractNumId w:val="4"/>
+  </w:num>
+  <w:num w:numId="7" w16cid:durableId="839469361">
+    <w:abstractNumId w:val="5"/>
+  </w:num>
+  <w:num w:numId="8" w16cid:durableId="17582159">
+    <w:abstractNumId w:val="6"/>
+  </w:num>
+  <w:num w:numId="9" w16cid:durableId="1351294969">
+    <w:abstractNumId w:val="10"/>
+  </w:num>
+  <w:num w:numId="10" w16cid:durableId="418675184">
+    <w:abstractNumId w:val="3"/>
+  </w:num>
+  <w:num w:numId="11" w16cid:durableId="646709366">
+    <w:abstractNumId w:val="8"/>
+  </w:num>
+  <w:num w:numId="12" w16cid:durableId="800417966">
+    <w:abstractNumId w:val="12"/>
+  </w:num>
+  <w:num w:numId="13" w16cid:durableId="114763950">
+    <w:abstractNumId w:val="7"/>
+  </w:num>
+  <w:num w:numId="14" w16cid:durableId="836768982">
+    <w:abstractNumId w:val="14"/>
+  </w:num>
+  <w:num w:numId="15" w16cid:durableId="1813406223">
+    <w:abstractNumId w:val="2"/>
+  </w:num>
+  <w:num w:numId="16" w16cid:durableId="886336383">
+    <w:abstractNumId w:val="11"/>
+  </w:num>
+  <w:num w:numId="17" w16cid:durableId="1267885439">
     <w:abstractNumId w:val="0"/>
   </w:num>
-  <w:num w:numId="3" w16cid:durableId="556160988">
-    <w:abstractNumId w:val="11"/>
-  </w:num>
-  <w:num w:numId="4" w16cid:durableId="1514033481">
-    <w:abstractNumId w:val="12"/>
-  </w:num>
-  <w:num w:numId="5" w16cid:durableId="50660879">
-    <w:abstractNumId w:val="4"/>
-  </w:num>
-  <w:num w:numId="6" w16cid:durableId="852963875">
-    <w:abstractNumId w:val="6"/>
-  </w:num>
-  <w:num w:numId="7" w16cid:durableId="1221134070">
-    <w:abstractNumId w:val="7"/>
-  </w:num>
-  <w:num w:numId="8" w16cid:durableId="457337854">
-    <w:abstractNumId w:val="8"/>
-  </w:num>
-  <w:num w:numId="9" w16cid:durableId="72363181">
-    <w:abstractNumId w:val="9"/>
-  </w:num>
-  <w:num w:numId="10" w16cid:durableId="891237231">
-    <w:abstractNumId w:val="1"/>
-  </w:num>
-  <w:num w:numId="11" w16cid:durableId="1854103381">
-    <w:abstractNumId w:val="13"/>
-  </w:num>
-  <w:num w:numId="12" w16cid:durableId="1761874974">
-    <w:abstractNumId w:val="3"/>
-  </w:num>
-  <w:num w:numId="13" w16cid:durableId="2126465631">
-    <w:abstractNumId w:val="10"/>
-  </w:num>
-  <w:num w:numId="14" w16cid:durableId="774711512">
+  <w:num w:numId="18" w16cid:durableId="189341307">
     <w:abstractNumId w:val="15"/>
-  </w:num>
-  <w:num w:numId="15" w16cid:durableId="1230576185">
-    <w:abstractNumId w:val="2"/>
-  </w:num>
-  <w:num w:numId="16" w16cid:durableId="528417614">
-    <w:abstractNumId w:val="14"/>
-  </w:num>
-  <w:num w:numId="17" w16cid:durableId="1293823893">
-    <w:abstractNumId w:val="5"/>
   </w:num>
 </w:numbering>
 </file>
@@ -39160,6 +41663,28 @@
       <w:iCs/>
     </w:rPr>
   </w:style>
+  <w:style w:type="character" w:styleId="Hipervnculo">
+    <w:name w:val="Hyperlink"/>
+    <w:basedOn w:val="Fuentedeprrafopredeter"/>
+    <w:uiPriority w:val="99"/>
+    <w:semiHidden/>
+    <w:unhideWhenUsed/>
+    <w:rPr>
+      <w:color w:val="0000FF"/>
+      <w:u w:val="single"/>
+    </w:rPr>
+  </w:style>
+  <w:style w:type="character" w:styleId="Hipervnculovisitado">
+    <w:name w:val="FollowedHyperlink"/>
+    <w:basedOn w:val="Fuentedeprrafopredeter"/>
+    <w:uiPriority w:val="99"/>
+    <w:semiHidden/>
+    <w:unhideWhenUsed/>
+    <w:rPr>
+      <w:color w:val="800080"/>
+      <w:u w:val="single"/>
+    </w:rPr>
+  </w:style>
 </w:styles>
 </file>
 

</xml_diff>